<commit_message>
final changes after video
</commit_message>
<xml_diff>
--- a/Lesson1 and Lesson9/Lesson1andLesson9Report.docx
+++ b/Lesson1 and Lesson9/Lesson1andLesson9Report.docx
@@ -287,7 +287,6 @@
         <w:rPr>
           <w:rFonts w:ascii="Times New Roman" w:eastAsia="Times New Roman" w:hAnsi="Times New Roman" w:cs="Times New Roman"/>
           <w:kern w:val="0"/>
-          <w:lang/>
           <w14:ligatures w14:val="none"/>
         </w:rPr>
       </w:pPr>
@@ -306,7 +305,6 @@
           <w:kern w:val="0"/>
           <w:sz w:val="36"/>
           <w:szCs w:val="36"/>
-          <w:lang/>
           <w14:ligatures w14:val="none"/>
         </w:rPr>
       </w:pPr>
@@ -320,7 +318,6 @@
           <w:kern w:val="0"/>
           <w:sz w:val="36"/>
           <w:szCs w:val="36"/>
-          <w:lang/>
           <w14:ligatures w14:val="none"/>
         </w:rPr>
         <w:t>Goal and Vulnerability Summary</w:t>
@@ -332,26 +329,23 @@
         <w:rPr>
           <w:rFonts w:ascii="Times New Roman" w:eastAsia="Times New Roman" w:hAnsi="Times New Roman" w:cs="Times New Roman"/>
           <w:kern w:val="0"/>
-          <w:lang/>
-          <w14:ligatures w14:val="none"/>
-        </w:rPr>
-      </w:pPr>
-    </w:p>
-    <w:p>
-      <w:pPr>
-        <w:spacing w:before="100" w:beforeAutospacing="1" w:after="100" w:afterAutospacing="1" w:line="240" w:lineRule="auto"/>
-        <w:rPr>
-          <w:rFonts w:ascii="Times New Roman" w:eastAsia="Times New Roman" w:hAnsi="Times New Roman" w:cs="Times New Roman"/>
-          <w:kern w:val="0"/>
-          <w:lang/>
-          <w14:ligatures w14:val="none"/>
-        </w:rPr>
-      </w:pPr>
-      <w:r>
-        <w:rPr>
-          <w:rFonts w:ascii="Times New Roman" w:eastAsia="Times New Roman" w:hAnsi="Times New Roman" w:cs="Times New Roman"/>
-          <w:kern w:val="0"/>
-          <w:lang/>
+          <w14:ligatures w14:val="none"/>
+        </w:rPr>
+      </w:pPr>
+    </w:p>
+    <w:p>
+      <w:pPr>
+        <w:spacing w:before="100" w:beforeAutospacing="1" w:after="100" w:afterAutospacing="1" w:line="240" w:lineRule="auto"/>
+        <w:rPr>
+          <w:rFonts w:ascii="Times New Roman" w:eastAsia="Times New Roman" w:hAnsi="Times New Roman" w:cs="Times New Roman"/>
+          <w:kern w:val="0"/>
+          <w14:ligatures w14:val="none"/>
+        </w:rPr>
+      </w:pPr>
+      <w:r>
+        <w:rPr>
+          <w:rFonts w:ascii="Times New Roman" w:eastAsia="Times New Roman" w:hAnsi="Times New Roman" w:cs="Times New Roman"/>
+          <w:kern w:val="0"/>
           <w14:ligatures w14:val="none"/>
         </w:rPr>
         <w:t>This lesson demonstrates an Event Injection vulnerability caused by unsafe deserialization of attacker-controlled input in the DVSA application. The main affected component is the request-processing logic inside the AWS Lambda backend, which handles incoming API requests from API Gateway. The vulnerability allows an attacker to inject malicious serialized data into the request body, which is then interpreted and executed as JavaScript code during deserialization. As a result, the attacker can achieve arbitrary code execution within the Lambda environment. The main weakness is the use of an insecure deserialization method (node-serialize) on untrusted input, which treats request data as executable content instead of plain data.</w:t>
@@ -363,7 +357,6 @@
         <w:rPr>
           <w:rFonts w:ascii="Times New Roman" w:eastAsia="Times New Roman" w:hAnsi="Times New Roman" w:cs="Times New Roman"/>
           <w:kern w:val="0"/>
-          <w:lang/>
           <w14:ligatures w14:val="none"/>
         </w:rPr>
       </w:pPr>
@@ -372,10 +365,9 @@
           <w:rFonts w:ascii="Times New Roman" w:eastAsia="Times New Roman" w:hAnsi="Times New Roman" w:cs="Times New Roman"/>
           <w:noProof/>
           <w:kern w:val="0"/>
-          <w:lang/>
         </w:rPr>
         <w:pict w14:anchorId="4A302E70">
-          <v:rect id="_x0000_i1025" alt="" style="width:468pt;height:.05pt;mso-width-percent:0;mso-height-percent:0;mso-width-percent:0;mso-height-percent:0" o:hralign="center" o:hrstd="t" o:hr="t" fillcolor="#a0a0a0" stroked="f"/>
+          <v:rect id="_x0000_i1040" alt="" style="width:468pt;height:.05pt;mso-width-percent:0;mso-height-percent:0;mso-width-percent:0;mso-height-percent:0" o:hralign="center" o:hrstd="t" o:hr="t" fillcolor="#a0a0a0" stroked="f"/>
         </w:pict>
       </w:r>
     </w:p>
@@ -393,7 +385,6 @@
           <w:kern w:val="0"/>
           <w:sz w:val="36"/>
           <w:szCs w:val="36"/>
-          <w:lang/>
           <w14:ligatures w14:val="none"/>
         </w:rPr>
       </w:pPr>
@@ -407,7 +398,6 @@
           <w:kern w:val="0"/>
           <w:sz w:val="36"/>
           <w:szCs w:val="36"/>
-          <w:lang/>
           <w14:ligatures w14:val="none"/>
         </w:rPr>
         <w:t>Why This Works / Root Cause</w:t>
@@ -419,25 +409,23 @@
         <w:rPr>
           <w:rFonts w:ascii="Times New Roman" w:eastAsia="Times New Roman" w:hAnsi="Times New Roman" w:cs="Times New Roman"/>
           <w:kern w:val="0"/>
-          <w:lang/>
-          <w14:ligatures w14:val="none"/>
-        </w:rPr>
-      </w:pPr>
-    </w:p>
-    <w:p>
-      <w:pPr>
-        <w:spacing w:before="100" w:beforeAutospacing="1" w:after="100" w:afterAutospacing="1" w:line="240" w:lineRule="auto"/>
-        <w:rPr>
-          <w:rFonts w:ascii="Times New Roman" w:eastAsia="Times New Roman" w:hAnsi="Times New Roman" w:cs="Times New Roman"/>
-          <w:kern w:val="0"/>
-          <w14:ligatures w14:val="none"/>
-        </w:rPr>
-      </w:pPr>
-      <w:r>
-        <w:rPr>
-          <w:rFonts w:ascii="Times New Roman" w:eastAsia="Times New Roman" w:hAnsi="Times New Roman" w:cs="Times New Roman"/>
-          <w:kern w:val="0"/>
-          <w:lang/>
+          <w14:ligatures w14:val="none"/>
+        </w:rPr>
+      </w:pPr>
+    </w:p>
+    <w:p>
+      <w:pPr>
+        <w:spacing w:before="100" w:beforeAutospacing="1" w:after="100" w:afterAutospacing="1" w:line="240" w:lineRule="auto"/>
+        <w:rPr>
+          <w:rFonts w:ascii="Times New Roman" w:eastAsia="Times New Roman" w:hAnsi="Times New Roman" w:cs="Times New Roman"/>
+          <w:kern w:val="0"/>
+          <w14:ligatures w14:val="none"/>
+        </w:rPr>
+      </w:pPr>
+      <w:r>
+        <w:rPr>
+          <w:rFonts w:ascii="Times New Roman" w:eastAsia="Times New Roman" w:hAnsi="Times New Roman" w:cs="Times New Roman"/>
+          <w:kern w:val="0"/>
           <w14:ligatures w14:val="none"/>
         </w:rPr>
         <w:t>This vulnerability occurs because the backend uses the node-serialize library to unserialize user-controlled input from the HTTP request without validation. Specifically, the application calls serialize.unserialize(event.body) on incoming request data. The node-serialize library supports a special format (</w:t>
@@ -448,7 +436,6 @@
           <w:i/>
           <w:iCs/>
           <w:kern w:val="0"/>
-          <w:lang/>
           <w14:ligatures w14:val="none"/>
         </w:rPr>
         <w:t>$$ND_FUNC$$</w:t>
@@ -457,7 +444,6 @@
         <w:rPr>
           <w:rFonts w:ascii="Times New Roman" w:eastAsia="Times New Roman" w:hAnsi="Times New Roman" w:cs="Times New Roman"/>
           <w:kern w:val="0"/>
-          <w:lang/>
           <w14:ligatures w14:val="none"/>
         </w:rPr>
         <w:t>) that allows serialized functions to be reconstructed and executed during deserialization. Because no validation or sanitization is performed before deserialization, an attacker can craft a payload containing a malicious function, which is then executed automatically. This results in arbitrary code execution inside the Lambda function before authentication and request handling logic is applied.</w:t>
@@ -485,7 +471,6 @@
         <w:rPr>
           <w:rFonts w:ascii="Times New Roman" w:eastAsia="Times New Roman" w:hAnsi="Times New Roman" w:cs="Times New Roman"/>
           <w:kern w:val="0"/>
-          <w:lang/>
           <w14:ligatures w14:val="none"/>
         </w:rPr>
       </w:pPr>
@@ -494,10 +479,9 @@
           <w:rFonts w:ascii="Times New Roman" w:eastAsia="Times New Roman" w:hAnsi="Times New Roman" w:cs="Times New Roman"/>
           <w:noProof/>
           <w:kern w:val="0"/>
-          <w:lang/>
         </w:rPr>
         <w:pict w14:anchorId="357254A2">
-          <v:rect id="_x0000_i1026" alt="" style="width:468pt;height:.05pt;mso-width-percent:0;mso-height-percent:0;mso-width-percent:0;mso-height-percent:0" o:hralign="center" o:hrstd="t" o:hr="t" fillcolor="#a0a0a0" stroked="f"/>
+          <v:rect id="_x0000_i1039" alt="" style="width:468pt;height:.05pt;mso-width-percent:0;mso-height-percent:0;mso-width-percent:0;mso-height-percent:0" o:hralign="center" o:hrstd="t" o:hr="t" fillcolor="#a0a0a0" stroked="f"/>
         </w:pict>
       </w:r>
     </w:p>
@@ -515,7 +499,6 @@
           <w:kern w:val="0"/>
           <w:sz w:val="36"/>
           <w:szCs w:val="36"/>
-          <w:lang/>
           <w14:ligatures w14:val="none"/>
         </w:rPr>
       </w:pPr>
@@ -529,7 +512,6 @@
           <w:kern w:val="0"/>
           <w:sz w:val="36"/>
           <w:szCs w:val="36"/>
-          <w:lang/>
           <w14:ligatures w14:val="none"/>
         </w:rPr>
         <w:t>Environment and Setup</w:t>
@@ -541,26 +523,23 @@
         <w:rPr>
           <w:rFonts w:ascii="Times New Roman" w:eastAsia="Times New Roman" w:hAnsi="Times New Roman" w:cs="Times New Roman"/>
           <w:kern w:val="0"/>
-          <w:lang/>
-          <w14:ligatures w14:val="none"/>
-        </w:rPr>
-      </w:pPr>
-    </w:p>
-    <w:p>
-      <w:pPr>
-        <w:spacing w:before="100" w:beforeAutospacing="1" w:after="100" w:afterAutospacing="1" w:line="240" w:lineRule="auto"/>
-        <w:rPr>
-          <w:rFonts w:ascii="Times New Roman" w:eastAsia="Times New Roman" w:hAnsi="Times New Roman" w:cs="Times New Roman"/>
-          <w:kern w:val="0"/>
-          <w:lang/>
-          <w14:ligatures w14:val="none"/>
-        </w:rPr>
-      </w:pPr>
-      <w:r>
-        <w:rPr>
-          <w:rFonts w:ascii="Times New Roman" w:eastAsia="Times New Roman" w:hAnsi="Times New Roman" w:cs="Times New Roman"/>
-          <w:kern w:val="0"/>
-          <w:lang/>
+          <w14:ligatures w14:val="none"/>
+        </w:rPr>
+      </w:pPr>
+    </w:p>
+    <w:p>
+      <w:pPr>
+        <w:spacing w:before="100" w:beforeAutospacing="1" w:after="100" w:afterAutospacing="1" w:line="240" w:lineRule="auto"/>
+        <w:rPr>
+          <w:rFonts w:ascii="Times New Roman" w:eastAsia="Times New Roman" w:hAnsi="Times New Roman" w:cs="Times New Roman"/>
+          <w:kern w:val="0"/>
+          <w14:ligatures w14:val="none"/>
+        </w:rPr>
+      </w:pPr>
+      <w:r>
+        <w:rPr>
+          <w:rFonts w:ascii="Times New Roman" w:eastAsia="Times New Roman" w:hAnsi="Times New Roman" w:cs="Times New Roman"/>
+          <w:kern w:val="0"/>
           <w14:ligatures w14:val="none"/>
         </w:rPr>
         <w:t>The vulnerability was tested using a deployed DVSA instance running in AWS. The frontend is hosted on an S3 static website, while backend requests are processed through Amazon API Gateway and forwarded to AWS Lambda functions. The vulnerable component is the Lambda function responsible for handling API requests and routing actions such as retrieving orders.</w:t>
@@ -572,37 +551,33 @@
         <w:rPr>
           <w:rFonts w:ascii="Times New Roman" w:eastAsia="Times New Roman" w:hAnsi="Times New Roman" w:cs="Times New Roman"/>
           <w:kern w:val="0"/>
-          <w:lang/>
-          <w14:ligatures w14:val="none"/>
-        </w:rPr>
-      </w:pPr>
-    </w:p>
-    <w:p>
-      <w:pPr>
-        <w:spacing w:before="100" w:beforeAutospacing="1" w:after="100" w:afterAutospacing="1" w:line="240" w:lineRule="auto"/>
-        <w:rPr>
-          <w:rFonts w:ascii="Times New Roman" w:eastAsia="Times New Roman" w:hAnsi="Times New Roman" w:cs="Times New Roman"/>
-          <w:kern w:val="0"/>
-          <w:lang/>
-          <w14:ligatures w14:val="none"/>
-        </w:rPr>
-      </w:pPr>
-    </w:p>
-    <w:p>
-      <w:pPr>
-        <w:spacing w:before="100" w:beforeAutospacing="1" w:after="100" w:afterAutospacing="1" w:line="240" w:lineRule="auto"/>
-        <w:rPr>
-          <w:rFonts w:ascii="Times New Roman" w:eastAsia="Times New Roman" w:hAnsi="Times New Roman" w:cs="Times New Roman"/>
-          <w:kern w:val="0"/>
-          <w:lang/>
-          <w14:ligatures w14:val="none"/>
-        </w:rPr>
-      </w:pPr>
-      <w:r>
-        <w:rPr>
-          <w:rFonts w:ascii="Times New Roman" w:eastAsia="Times New Roman" w:hAnsi="Times New Roman" w:cs="Times New Roman"/>
-          <w:kern w:val="0"/>
-          <w:lang/>
+          <w14:ligatures w14:val="none"/>
+        </w:rPr>
+      </w:pPr>
+    </w:p>
+    <w:p>
+      <w:pPr>
+        <w:spacing w:before="100" w:beforeAutospacing="1" w:after="100" w:afterAutospacing="1" w:line="240" w:lineRule="auto"/>
+        <w:rPr>
+          <w:rFonts w:ascii="Times New Roman" w:eastAsia="Times New Roman" w:hAnsi="Times New Roman" w:cs="Times New Roman"/>
+          <w:kern w:val="0"/>
+          <w14:ligatures w14:val="none"/>
+        </w:rPr>
+      </w:pPr>
+    </w:p>
+    <w:p>
+      <w:pPr>
+        <w:spacing w:before="100" w:beforeAutospacing="1" w:after="100" w:afterAutospacing="1" w:line="240" w:lineRule="auto"/>
+        <w:rPr>
+          <w:rFonts w:ascii="Times New Roman" w:eastAsia="Times New Roman" w:hAnsi="Times New Roman" w:cs="Times New Roman"/>
+          <w:kern w:val="0"/>
+          <w14:ligatures w14:val="none"/>
+        </w:rPr>
+      </w:pPr>
+      <w:r>
+        <w:rPr>
+          <w:rFonts w:ascii="Times New Roman" w:eastAsia="Times New Roman" w:hAnsi="Times New Roman" w:cs="Times New Roman"/>
+          <w:kern w:val="0"/>
           <w14:ligatures w14:val="none"/>
         </w:rPr>
         <w:lastRenderedPageBreak/>
@@ -612,7 +587,6 @@
         <w:rPr>
           <w:rFonts w:ascii="Times New Roman" w:eastAsia="Times New Roman" w:hAnsi="Times New Roman" w:cs="Times New Roman"/>
           <w:kern w:val="0"/>
-          <w:lang/>
           <w14:ligatures w14:val="none"/>
         </w:rPr>
         <w:t>/dvsa</w:t>
@@ -621,7 +595,6 @@
         <w:rPr>
           <w:rFonts w:ascii="Times New Roman" w:eastAsia="Times New Roman" w:hAnsi="Times New Roman" w:cs="Times New Roman"/>
           <w:kern w:val="0"/>
-          <w:lang/>
           <w14:ligatures w14:val="none"/>
         </w:rPr>
         <w:t>/order route, accessed through the API Gateway invoke URL.</w:t>
@@ -633,26 +606,23 @@
         <w:rPr>
           <w:rFonts w:ascii="Times New Roman" w:eastAsia="Times New Roman" w:hAnsi="Times New Roman" w:cs="Times New Roman"/>
           <w:kern w:val="0"/>
-          <w:lang/>
-          <w14:ligatures w14:val="none"/>
-        </w:rPr>
-      </w:pPr>
-    </w:p>
-    <w:p>
-      <w:pPr>
-        <w:spacing w:before="100" w:beforeAutospacing="1" w:after="100" w:afterAutospacing="1" w:line="240" w:lineRule="auto"/>
-        <w:rPr>
-          <w:rFonts w:ascii="Times New Roman" w:eastAsia="Times New Roman" w:hAnsi="Times New Roman" w:cs="Times New Roman"/>
-          <w:kern w:val="0"/>
-          <w:lang/>
-          <w14:ligatures w14:val="none"/>
-        </w:rPr>
-      </w:pPr>
-      <w:r>
-        <w:rPr>
-          <w:rFonts w:ascii="Times New Roman" w:eastAsia="Times New Roman" w:hAnsi="Times New Roman" w:cs="Times New Roman"/>
-          <w:kern w:val="0"/>
-          <w:lang/>
+          <w14:ligatures w14:val="none"/>
+        </w:rPr>
+      </w:pPr>
+    </w:p>
+    <w:p>
+      <w:pPr>
+        <w:spacing w:before="100" w:beforeAutospacing="1" w:after="100" w:afterAutospacing="1" w:line="240" w:lineRule="auto"/>
+        <w:rPr>
+          <w:rFonts w:ascii="Times New Roman" w:eastAsia="Times New Roman" w:hAnsi="Times New Roman" w:cs="Times New Roman"/>
+          <w:kern w:val="0"/>
+          <w14:ligatures w14:val="none"/>
+        </w:rPr>
+      </w:pPr>
+      <w:r>
+        <w:rPr>
+          <w:rFonts w:ascii="Times New Roman" w:eastAsia="Times New Roman" w:hAnsi="Times New Roman" w:cs="Times New Roman"/>
+          <w:kern w:val="0"/>
           <w14:ligatures w14:val="none"/>
         </w:rPr>
         <w:t>The tools used in this demonstration included:</w:t>
@@ -668,15 +638,13 @@
         <w:rPr>
           <w:rFonts w:ascii="Times New Roman" w:eastAsia="Times New Roman" w:hAnsi="Times New Roman" w:cs="Times New Roman"/>
           <w:kern w:val="0"/>
-          <w:lang/>
-          <w14:ligatures w14:val="none"/>
-        </w:rPr>
-      </w:pPr>
-      <w:r>
-        <w:rPr>
-          <w:rFonts w:ascii="Times New Roman" w:eastAsia="Times New Roman" w:hAnsi="Times New Roman" w:cs="Times New Roman"/>
-          <w:kern w:val="0"/>
-          <w:lang/>
+          <w14:ligatures w14:val="none"/>
+        </w:rPr>
+      </w:pPr>
+      <w:r>
+        <w:rPr>
+          <w:rFonts w:ascii="Times New Roman" w:eastAsia="Times New Roman" w:hAnsi="Times New Roman" w:cs="Times New Roman"/>
+          <w:kern w:val="0"/>
           <w14:ligatures w14:val="none"/>
         </w:rPr>
         <w:t>Browser DevTools (to capture API requests)</w:t>
@@ -692,15 +660,13 @@
         <w:rPr>
           <w:rFonts w:ascii="Times New Roman" w:eastAsia="Times New Roman" w:hAnsi="Times New Roman" w:cs="Times New Roman"/>
           <w:kern w:val="0"/>
-          <w:lang/>
-          <w14:ligatures w14:val="none"/>
-        </w:rPr>
-      </w:pPr>
-      <w:r>
-        <w:rPr>
-          <w:rFonts w:ascii="Times New Roman" w:eastAsia="Times New Roman" w:hAnsi="Times New Roman" w:cs="Times New Roman"/>
-          <w:kern w:val="0"/>
-          <w:lang/>
+          <w14:ligatures w14:val="none"/>
+        </w:rPr>
+      </w:pPr>
+      <w:r>
+        <w:rPr>
+          <w:rFonts w:ascii="Times New Roman" w:eastAsia="Times New Roman" w:hAnsi="Times New Roman" w:cs="Times New Roman"/>
+          <w:kern w:val="0"/>
           <w14:ligatures w14:val="none"/>
         </w:rPr>
         <w:t>Postman (to modify and send custom HTTP requests)</w:t>
@@ -716,15 +682,13 @@
         <w:rPr>
           <w:rFonts w:ascii="Times New Roman" w:eastAsia="Times New Roman" w:hAnsi="Times New Roman" w:cs="Times New Roman"/>
           <w:kern w:val="0"/>
-          <w:lang/>
-          <w14:ligatures w14:val="none"/>
-        </w:rPr>
-      </w:pPr>
-      <w:r>
-        <w:rPr>
-          <w:rFonts w:ascii="Times New Roman" w:eastAsia="Times New Roman" w:hAnsi="Times New Roman" w:cs="Times New Roman"/>
-          <w:kern w:val="0"/>
-          <w:lang/>
+          <w14:ligatures w14:val="none"/>
+        </w:rPr>
+      </w:pPr>
+      <w:r>
+        <w:rPr>
+          <w:rFonts w:ascii="Times New Roman" w:eastAsia="Times New Roman" w:hAnsi="Times New Roman" w:cs="Times New Roman"/>
+          <w:kern w:val="0"/>
           <w14:ligatures w14:val="none"/>
         </w:rPr>
         <w:t>AWS CloudWatch Logs (to observe backend execution and errors)</w:t>
@@ -736,7 +700,6 @@
         <w:rPr>
           <w:rFonts w:ascii="Times New Roman" w:eastAsia="Times New Roman" w:hAnsi="Times New Roman" w:cs="Times New Roman"/>
           <w:kern w:val="0"/>
-          <w:lang/>
           <w14:ligatures w14:val="none"/>
         </w:rPr>
       </w:pPr>
@@ -745,10 +708,9 @@
           <w:rFonts w:ascii="Times New Roman" w:eastAsia="Times New Roman" w:hAnsi="Times New Roman" w:cs="Times New Roman"/>
           <w:noProof/>
           <w:kern w:val="0"/>
-          <w:lang/>
         </w:rPr>
         <w:pict w14:anchorId="7E258B70">
-          <v:rect id="_x0000_i1027" alt="" style="width:468pt;height:.05pt;mso-width-percent:0;mso-height-percent:0;mso-width-percent:0;mso-height-percent:0" o:hralign="center" o:hrstd="t" o:hr="t" fillcolor="#a0a0a0" stroked="f"/>
+          <v:rect id="_x0000_i1038" alt="" style="width:468pt;height:.05pt;mso-width-percent:0;mso-height-percent:0;mso-width-percent:0;mso-height-percent:0" o:hralign="center" o:hrstd="t" o:hr="t" fillcolor="#a0a0a0" stroked="f"/>
         </w:pict>
       </w:r>
     </w:p>
@@ -766,7 +728,6 @@
           <w:kern w:val="0"/>
           <w:sz w:val="36"/>
           <w:szCs w:val="36"/>
-          <w:lang/>
           <w14:ligatures w14:val="none"/>
         </w:rPr>
       </w:pPr>
@@ -780,7 +741,6 @@
           <w:kern w:val="0"/>
           <w:sz w:val="36"/>
           <w:szCs w:val="36"/>
-          <w:lang/>
           <w14:ligatures w14:val="none"/>
         </w:rPr>
         <w:t>Reproduction Steps</w:t>
@@ -792,26 +752,23 @@
         <w:rPr>
           <w:rFonts w:ascii="Times New Roman" w:eastAsia="Times New Roman" w:hAnsi="Times New Roman" w:cs="Times New Roman"/>
           <w:kern w:val="0"/>
-          <w:lang/>
-          <w14:ligatures w14:val="none"/>
-        </w:rPr>
-      </w:pPr>
-    </w:p>
-    <w:p>
-      <w:pPr>
-        <w:spacing w:before="100" w:beforeAutospacing="1" w:after="100" w:afterAutospacing="1" w:line="240" w:lineRule="auto"/>
-        <w:rPr>
-          <w:rFonts w:ascii="Times New Roman" w:eastAsia="Times New Roman" w:hAnsi="Times New Roman" w:cs="Times New Roman"/>
-          <w:kern w:val="0"/>
-          <w:lang/>
-          <w14:ligatures w14:val="none"/>
-        </w:rPr>
-      </w:pPr>
-      <w:r>
-        <w:rPr>
-          <w:rFonts w:ascii="Times New Roman" w:eastAsia="Times New Roman" w:hAnsi="Times New Roman" w:cs="Times New Roman"/>
-          <w:kern w:val="0"/>
-          <w:lang/>
+          <w14:ligatures w14:val="none"/>
+        </w:rPr>
+      </w:pPr>
+    </w:p>
+    <w:p>
+      <w:pPr>
+        <w:spacing w:before="100" w:beforeAutospacing="1" w:after="100" w:afterAutospacing="1" w:line="240" w:lineRule="auto"/>
+        <w:rPr>
+          <w:rFonts w:ascii="Times New Roman" w:eastAsia="Times New Roman" w:hAnsi="Times New Roman" w:cs="Times New Roman"/>
+          <w:kern w:val="0"/>
+          <w14:ligatures w14:val="none"/>
+        </w:rPr>
+      </w:pPr>
+      <w:r>
+        <w:rPr>
+          <w:rFonts w:ascii="Times New Roman" w:eastAsia="Times New Roman" w:hAnsi="Times New Roman" w:cs="Times New Roman"/>
+          <w:kern w:val="0"/>
           <w14:ligatures w14:val="none"/>
         </w:rPr>
         <w:t>The attack begins by sending a normal request to the API using a valid action:</w:t>
@@ -823,15 +780,13 @@
         <w:rPr>
           <w:rFonts w:ascii="Times New Roman" w:eastAsia="Times New Roman" w:hAnsi="Times New Roman" w:cs="Times New Roman"/>
           <w:kern w:val="0"/>
-          <w:lang/>
-          <w14:ligatures w14:val="none"/>
-        </w:rPr>
-      </w:pPr>
-      <w:r>
-        <w:rPr>
-          <w:rFonts w:ascii="Times New Roman" w:eastAsia="Times New Roman" w:hAnsi="Times New Roman" w:cs="Times New Roman"/>
-          <w:kern w:val="0"/>
-          <w:lang/>
+          <w14:ligatures w14:val="none"/>
+        </w:rPr>
+      </w:pPr>
+      <w:r>
+        <w:rPr>
+          <w:rFonts w:ascii="Times New Roman" w:eastAsia="Times New Roman" w:hAnsi="Times New Roman" w:cs="Times New Roman"/>
+          <w:kern w:val="0"/>
           <w14:ligatures w14:val="none"/>
         </w:rPr>
         <w:t>{ “action”: “orders” }</w:t>
@@ -843,15 +798,13 @@
         <w:rPr>
           <w:rFonts w:ascii="Times New Roman" w:eastAsia="Times New Roman" w:hAnsi="Times New Roman" w:cs="Times New Roman"/>
           <w:kern w:val="0"/>
-          <w:lang/>
-          <w14:ligatures w14:val="none"/>
-        </w:rPr>
-      </w:pPr>
-      <w:r>
-        <w:rPr>
-          <w:rFonts w:ascii="Times New Roman" w:eastAsia="Times New Roman" w:hAnsi="Times New Roman" w:cs="Times New Roman"/>
-          <w:kern w:val="0"/>
-          <w:lang/>
+          <w14:ligatures w14:val="none"/>
+        </w:rPr>
+      </w:pPr>
+      <w:r>
+        <w:rPr>
+          <w:rFonts w:ascii="Times New Roman" w:eastAsia="Times New Roman" w:hAnsi="Times New Roman" w:cs="Times New Roman"/>
+          <w:kern w:val="0"/>
           <w14:ligatures w14:val="none"/>
         </w:rPr>
         <w:t>This request is processed successfully, and the backend returns a normal response containing the user’s orders.</w:t>
@@ -863,7 +816,6 @@
         <w:rPr>
           <w:rFonts w:ascii="Times New Roman" w:eastAsia="Times New Roman" w:hAnsi="Times New Roman" w:cs="Times New Roman"/>
           <w:kern w:val="0"/>
-          <w:lang/>
           <w14:ligatures w14:val="none"/>
         </w:rPr>
       </w:pPr>
@@ -874,7 +826,6 @@
         <w:rPr>
           <w:rFonts w:ascii="Times New Roman" w:eastAsia="Times New Roman" w:hAnsi="Times New Roman" w:cs="Times New Roman"/>
           <w:kern w:val="0"/>
-          <w:lang/>
           <w14:ligatures w14:val="none"/>
         </w:rPr>
       </w:pPr>
@@ -883,7 +834,6 @@
           <w:rFonts w:ascii="Apple Color Emoji" w:eastAsia="Times New Roman" w:hAnsi="Apple Color Emoji" w:cs="Apple Color Emoji"/>
           <w:noProof/>
           <w:kern w:val="0"/>
-          <w:lang/>
           <w14:ligatures w14:val="none"/>
         </w:rPr>
         <w:drawing>
@@ -927,10 +877,9 @@
           <w:rFonts w:ascii="Times New Roman" w:eastAsia="Times New Roman" w:hAnsi="Times New Roman" w:cs="Times New Roman"/>
           <w:noProof/>
           <w:kern w:val="0"/>
-          <w:lang/>
         </w:rPr>
         <w:pict w14:anchorId="0163378F">
-          <v:rect id="_x0000_i1028" alt="" style="width:468pt;height:.05pt;mso-width-percent:0;mso-height-percent:0;mso-width-percent:0;mso-height-percent:0" o:hralign="center" o:hrstd="t" o:hr="t" fillcolor="#a0a0a0" stroked="f"/>
+          <v:rect id="_x0000_i1037" alt="" style="width:468pt;height:.05pt;mso-width-percent:0;mso-height-percent:0;mso-width-percent:0;mso-height-percent:0" o:hralign="center" o:hrstd="t" o:hr="t" fillcolor="#a0a0a0" stroked="f"/>
         </w:pict>
       </w:r>
     </w:p>
@@ -940,15 +889,13 @@
         <w:rPr>
           <w:rFonts w:ascii="Times New Roman" w:eastAsia="Times New Roman" w:hAnsi="Times New Roman" w:cs="Times New Roman"/>
           <w:kern w:val="0"/>
-          <w:lang/>
-          <w14:ligatures w14:val="none"/>
-        </w:rPr>
-      </w:pPr>
-      <w:r>
-        <w:rPr>
-          <w:rFonts w:ascii="Times New Roman" w:eastAsia="Times New Roman" w:hAnsi="Times New Roman" w:cs="Times New Roman"/>
-          <w:kern w:val="0"/>
-          <w:lang/>
+          <w14:ligatures w14:val="none"/>
+        </w:rPr>
+      </w:pPr>
+      <w:r>
+        <w:rPr>
+          <w:rFonts w:ascii="Times New Roman" w:eastAsia="Times New Roman" w:hAnsi="Times New Roman" w:cs="Times New Roman"/>
+          <w:kern w:val="0"/>
           <w14:ligatures w14:val="none"/>
         </w:rPr>
         <w:lastRenderedPageBreak/>
@@ -961,15 +908,13 @@
         <w:rPr>
           <w:rFonts w:ascii="Times New Roman" w:eastAsia="Times New Roman" w:hAnsi="Times New Roman" w:cs="Times New Roman"/>
           <w:kern w:val="0"/>
-          <w:lang/>
-          <w14:ligatures w14:val="none"/>
-        </w:rPr>
-      </w:pPr>
-      <w:r>
-        <w:rPr>
-          <w:rFonts w:ascii="Times New Roman" w:eastAsia="Times New Roman" w:hAnsi="Times New Roman" w:cs="Times New Roman"/>
-          <w:kern w:val="0"/>
-          <w:lang/>
+          <w14:ligatures w14:val="none"/>
+        </w:rPr>
+      </w:pPr>
+      <w:r>
+        <w:rPr>
+          <w:rFonts w:ascii="Times New Roman" w:eastAsia="Times New Roman" w:hAnsi="Times New Roman" w:cs="Times New Roman"/>
+          <w:kern w:val="0"/>
           <w14:ligatures w14:val="none"/>
         </w:rPr>
         <w:t>{</w:t>
@@ -981,15 +926,13 @@
         <w:rPr>
           <w:rFonts w:ascii="Times New Roman" w:eastAsia="Times New Roman" w:hAnsi="Times New Roman" w:cs="Times New Roman"/>
           <w:kern w:val="0"/>
-          <w:lang/>
-          <w14:ligatures w14:val="none"/>
-        </w:rPr>
-      </w:pPr>
-      <w:r>
-        <w:rPr>
-          <w:rFonts w:ascii="Times New Roman" w:eastAsia="Times New Roman" w:hAnsi="Times New Roman" w:cs="Times New Roman"/>
-          <w:kern w:val="0"/>
-          <w:lang/>
+          <w14:ligatures w14:val="none"/>
+        </w:rPr>
+      </w:pPr>
+      <w:r>
+        <w:rPr>
+          <w:rFonts w:ascii="Times New Roman" w:eastAsia="Times New Roman" w:hAnsi="Times New Roman" w:cs="Times New Roman"/>
+          <w:kern w:val="0"/>
           <w14:ligatures w14:val="none"/>
         </w:rPr>
         <w:t>“action”: “orders”,</w:t>
@@ -1001,15 +944,13 @@
         <w:rPr>
           <w:rFonts w:ascii="Times New Roman" w:eastAsia="Times New Roman" w:hAnsi="Times New Roman" w:cs="Times New Roman"/>
           <w:kern w:val="0"/>
-          <w:lang/>
-          <w14:ligatures w14:val="none"/>
-        </w:rPr>
-      </w:pPr>
-      <w:r>
-        <w:rPr>
-          <w:rFonts w:ascii="Times New Roman" w:eastAsia="Times New Roman" w:hAnsi="Times New Roman" w:cs="Times New Roman"/>
-          <w:kern w:val="0"/>
-          <w:lang/>
+          <w14:ligatures w14:val="none"/>
+        </w:rPr>
+      </w:pPr>
+      <w:r>
+        <w:rPr>
+          <w:rFonts w:ascii="Times New Roman" w:eastAsia="Times New Roman" w:hAnsi="Times New Roman" w:cs="Times New Roman"/>
+          <w:kern w:val="0"/>
           <w14:ligatures w14:val="none"/>
         </w:rPr>
         <w:t>“test”: “_$$ND_FUNC$$_function(){throw ‘INJECTEDbyMK’}()”</w:t>
@@ -1021,15 +962,13 @@
         <w:rPr>
           <w:rFonts w:ascii="Times New Roman" w:eastAsia="Times New Roman" w:hAnsi="Times New Roman" w:cs="Times New Roman"/>
           <w:kern w:val="0"/>
-          <w:lang/>
-          <w14:ligatures w14:val="none"/>
-        </w:rPr>
-      </w:pPr>
-      <w:r>
-        <w:rPr>
-          <w:rFonts w:ascii="Times New Roman" w:eastAsia="Times New Roman" w:hAnsi="Times New Roman" w:cs="Times New Roman"/>
-          <w:kern w:val="0"/>
-          <w:lang/>
+          <w14:ligatures w14:val="none"/>
+        </w:rPr>
+      </w:pPr>
+      <w:r>
+        <w:rPr>
+          <w:rFonts w:ascii="Times New Roman" w:eastAsia="Times New Roman" w:hAnsi="Times New Roman" w:cs="Times New Roman"/>
+          <w:kern w:val="0"/>
           <w14:ligatures w14:val="none"/>
         </w:rPr>
         <w:t>}</w:t>
@@ -1041,7 +980,6 @@
         <w:rPr>
           <w:rFonts w:ascii="Times New Roman" w:eastAsia="Times New Roman" w:hAnsi="Times New Roman" w:cs="Times New Roman"/>
           <w:kern w:val="0"/>
-          <w:lang/>
           <w14:ligatures w14:val="none"/>
         </w:rPr>
       </w:pPr>
@@ -1050,7 +988,6 @@
           <w:rFonts w:ascii="Apple Color Emoji" w:eastAsia="Times New Roman" w:hAnsi="Apple Color Emoji" w:cs="Apple Color Emoji"/>
           <w:noProof/>
           <w:kern w:val="0"/>
-          <w:lang/>
           <w14:ligatures w14:val="none"/>
         </w:rPr>
         <w:drawing>
@@ -1094,10 +1031,9 @@
           <w:rFonts w:ascii="Times New Roman" w:eastAsia="Times New Roman" w:hAnsi="Times New Roman" w:cs="Times New Roman"/>
           <w:noProof/>
           <w:kern w:val="0"/>
-          <w:lang/>
         </w:rPr>
         <w:pict w14:anchorId="565723C4">
-          <v:rect id="_x0000_i1029" alt="" style="width:468pt;height:.05pt;mso-width-percent:0;mso-height-percent:0;mso-width-percent:0;mso-height-percent:0" o:hralign="center" o:hrstd="t" o:hr="t" fillcolor="#a0a0a0" stroked="f"/>
+          <v:rect id="_x0000_i1036" alt="" style="width:468pt;height:.05pt;mso-width-percent:0;mso-height-percent:0;mso-width-percent:0;mso-height-percent:0" o:hralign="center" o:hrstd="t" o:hr="t" fillcolor="#a0a0a0" stroked="f"/>
         </w:pict>
       </w:r>
     </w:p>
@@ -1107,15 +1043,13 @@
         <w:rPr>
           <w:rFonts w:ascii="Times New Roman" w:eastAsia="Times New Roman" w:hAnsi="Times New Roman" w:cs="Times New Roman"/>
           <w:kern w:val="0"/>
-          <w:lang/>
-          <w14:ligatures w14:val="none"/>
-        </w:rPr>
-      </w:pPr>
-      <w:r>
-        <w:rPr>
-          <w:rFonts w:ascii="Times New Roman" w:eastAsia="Times New Roman" w:hAnsi="Times New Roman" w:cs="Times New Roman"/>
-          <w:kern w:val="0"/>
-          <w:lang/>
+          <w14:ligatures w14:val="none"/>
+        </w:rPr>
+      </w:pPr>
+      <w:r>
+        <w:rPr>
+          <w:rFonts w:ascii="Times New Roman" w:eastAsia="Times New Roman" w:hAnsi="Times New Roman" w:cs="Times New Roman"/>
+          <w:kern w:val="0"/>
           <w14:ligatures w14:val="none"/>
         </w:rPr>
         <w:t>The attacker sends this crafted request to the same API endpoint using Postman.</w:t>
@@ -1124,7 +1058,6 @@
         <w:rPr>
           <w:rFonts w:ascii="Times New Roman" w:eastAsia="Times New Roman" w:hAnsi="Times New Roman" w:cs="Times New Roman"/>
           <w:kern w:val="0"/>
-          <w:lang/>
           <w14:ligatures w14:val="none"/>
         </w:rPr>
         <w:t xml:space="preserve"> </w:t>
@@ -1133,7 +1066,6 @@
         <w:rPr>
           <w:rFonts w:ascii="Times New Roman" w:eastAsia="Times New Roman" w:hAnsi="Times New Roman" w:cs="Times New Roman"/>
           <w:kern w:val="0"/>
-          <w:lang/>
           <w14:ligatures w14:val="none"/>
         </w:rPr>
         <w:t>After sending the request, the API returns a 502 Bad Gateway error, indicating that the backend Lambda function encountered an internal failure.</w:t>
@@ -1145,7 +1077,6 @@
         <w:rPr>
           <w:rFonts w:ascii="Times New Roman" w:eastAsia="Times New Roman" w:hAnsi="Times New Roman" w:cs="Times New Roman"/>
           <w:kern w:val="0"/>
-          <w:lang/>
           <w14:ligatures w14:val="none"/>
         </w:rPr>
       </w:pPr>
@@ -1154,7 +1085,6 @@
           <w:rFonts w:ascii="Apple Color Emoji" w:eastAsia="Times New Roman" w:hAnsi="Apple Color Emoji" w:cs="Apple Color Emoji"/>
           <w:noProof/>
           <w:kern w:val="0"/>
-          <w:lang/>
           <w14:ligatures w14:val="none"/>
         </w:rPr>
         <w:drawing>
@@ -1200,7 +1130,6 @@
         <w:rPr>
           <w:rFonts w:ascii="Times New Roman" w:eastAsia="Times New Roman" w:hAnsi="Times New Roman" w:cs="Times New Roman"/>
           <w:kern w:val="0"/>
-          <w:lang/>
           <w14:ligatures w14:val="none"/>
         </w:rPr>
       </w:pPr>
@@ -1209,10 +1138,9 @@
           <w:rFonts w:ascii="Times New Roman" w:eastAsia="Times New Roman" w:hAnsi="Times New Roman" w:cs="Times New Roman"/>
           <w:noProof/>
           <w:kern w:val="0"/>
-          <w:lang/>
         </w:rPr>
         <w:pict w14:anchorId="68040698">
-          <v:rect id="_x0000_i1030" alt="" style="width:468pt;height:.05pt;mso-width-percent:0;mso-height-percent:0;mso-width-percent:0;mso-height-percent:0" o:hralign="center" o:hrstd="t" o:hr="t" fillcolor="#a0a0a0" stroked="f"/>
+          <v:rect id="_x0000_i1035" alt="" style="width:468pt;height:.05pt;mso-width-percent:0;mso-height-percent:0;mso-width-percent:0;mso-height-percent:0" o:hralign="center" o:hrstd="t" o:hr="t" fillcolor="#a0a0a0" stroked="f"/>
         </w:pict>
       </w:r>
     </w:p>
@@ -1222,15 +1150,13 @@
         <w:rPr>
           <w:rFonts w:ascii="Times New Roman" w:eastAsia="Times New Roman" w:hAnsi="Times New Roman" w:cs="Times New Roman"/>
           <w:kern w:val="0"/>
-          <w:lang/>
-          <w14:ligatures w14:val="none"/>
-        </w:rPr>
-      </w:pPr>
-      <w:r>
-        <w:rPr>
-          <w:rFonts w:ascii="Times New Roman" w:eastAsia="Times New Roman" w:hAnsi="Times New Roman" w:cs="Times New Roman"/>
-          <w:kern w:val="0"/>
-          <w:lang/>
+          <w14:ligatures w14:val="none"/>
+        </w:rPr>
+      </w:pPr>
+      <w:r>
+        <w:rPr>
+          <w:rFonts w:ascii="Times New Roman" w:eastAsia="Times New Roman" w:hAnsi="Times New Roman" w:cs="Times New Roman"/>
+          <w:kern w:val="0"/>
           <w14:ligatures w14:val="none"/>
         </w:rPr>
         <w:lastRenderedPageBreak/>
@@ -1243,7 +1169,6 @@
         <w:rPr>
           <w:rFonts w:ascii="Times New Roman" w:eastAsia="Times New Roman" w:hAnsi="Times New Roman" w:cs="Times New Roman"/>
           <w:kern w:val="0"/>
-          <w:lang/>
           <w14:ligatures w14:val="none"/>
         </w:rPr>
       </w:pPr>
@@ -1252,7 +1177,6 @@
           <w:rFonts w:ascii="Times New Roman" w:eastAsia="Times New Roman" w:hAnsi="Times New Roman" w:cs="Times New Roman"/>
           <w:noProof/>
           <w:kern w:val="0"/>
-          <w:lang/>
           <w14:ligatures w14:val="none"/>
         </w:rPr>
         <w:drawing>
@@ -1298,7 +1222,6 @@
         <w:rPr>
           <w:rFonts w:ascii="Times New Roman" w:eastAsia="Times New Roman" w:hAnsi="Times New Roman" w:cs="Times New Roman"/>
           <w:kern w:val="0"/>
-          <w:lang/>
           <w14:ligatures w14:val="none"/>
         </w:rPr>
       </w:pPr>
@@ -1307,10 +1230,9 @@
           <w:rFonts w:ascii="Times New Roman" w:eastAsia="Times New Roman" w:hAnsi="Times New Roman" w:cs="Times New Roman"/>
           <w:noProof/>
           <w:kern w:val="0"/>
-          <w:lang/>
         </w:rPr>
         <w:pict w14:anchorId="7D7DEC34">
-          <v:rect id="_x0000_i1031" alt="" style="width:468pt;height:.05pt;mso-width-percent:0;mso-height-percent:0;mso-width-percent:0;mso-height-percent:0" o:hralign="center" o:hrstd="t" o:hr="t" fillcolor="#a0a0a0" stroked="f"/>
+          <v:rect id="_x0000_i1034" alt="" style="width:468pt;height:.05pt;mso-width-percent:0;mso-height-percent:0;mso-width-percent:0;mso-height-percent:0" o:hralign="center" o:hrstd="t" o:hr="t" fillcolor="#a0a0a0" stroked="f"/>
         </w:pict>
       </w:r>
     </w:p>
@@ -1328,7 +1250,6 @@
           <w:kern w:val="0"/>
           <w:sz w:val="36"/>
           <w:szCs w:val="36"/>
-          <w:lang/>
           <w14:ligatures w14:val="none"/>
         </w:rPr>
       </w:pPr>
@@ -1342,7 +1263,6 @@
           <w:kern w:val="0"/>
           <w:sz w:val="36"/>
           <w:szCs w:val="36"/>
-          <w:lang/>
           <w14:ligatures w14:val="none"/>
         </w:rPr>
         <w:t>Evidence and Proof</w:t>
@@ -1354,25 +1274,23 @@
         <w:rPr>
           <w:rFonts w:ascii="Times New Roman" w:eastAsia="Times New Roman" w:hAnsi="Times New Roman" w:cs="Times New Roman"/>
           <w:kern w:val="0"/>
-          <w:lang/>
-          <w14:ligatures w14:val="none"/>
-        </w:rPr>
-      </w:pPr>
-    </w:p>
-    <w:p>
-      <w:pPr>
-        <w:spacing w:before="100" w:beforeAutospacing="1" w:after="100" w:afterAutospacing="1" w:line="240" w:lineRule="auto"/>
-        <w:rPr>
-          <w:rFonts w:ascii="Times New Roman" w:eastAsia="Times New Roman" w:hAnsi="Times New Roman" w:cs="Times New Roman"/>
-          <w:kern w:val="0"/>
-          <w14:ligatures w14:val="none"/>
-        </w:rPr>
-      </w:pPr>
-      <w:r>
-        <w:rPr>
-          <w:rFonts w:ascii="Times New Roman" w:eastAsia="Times New Roman" w:hAnsi="Times New Roman" w:cs="Times New Roman"/>
-          <w:kern w:val="0"/>
-          <w:lang/>
+          <w14:ligatures w14:val="none"/>
+        </w:rPr>
+      </w:pPr>
+    </w:p>
+    <w:p>
+      <w:pPr>
+        <w:spacing w:before="100" w:beforeAutospacing="1" w:after="100" w:afterAutospacing="1" w:line="240" w:lineRule="auto"/>
+        <w:rPr>
+          <w:rFonts w:ascii="Times New Roman" w:eastAsia="Times New Roman" w:hAnsi="Times New Roman" w:cs="Times New Roman"/>
+          <w:kern w:val="0"/>
+          <w14:ligatures w14:val="none"/>
+        </w:rPr>
+      </w:pPr>
+      <w:r>
+        <w:rPr>
+          <w:rFonts w:ascii="Times New Roman" w:eastAsia="Times New Roman" w:hAnsi="Times New Roman" w:cs="Times New Roman"/>
+          <w:kern w:val="0"/>
           <w14:ligatures w14:val="none"/>
         </w:rPr>
         <w:t>The vulnerability is confirmed by the fact that attacker-controlled input is executed inside the Lambda runtime. The key evidence is the CloudWatch log entry showing:</w:t>
@@ -1391,7 +1309,6 @@
         <w:rPr>
           <w:rFonts w:ascii="Times New Roman" w:eastAsia="Times New Roman" w:hAnsi="Times New Roman" w:cs="Times New Roman"/>
           <w:kern w:val="0"/>
-          <w:lang/>
           <w14:ligatures w14:val="none"/>
         </w:rPr>
         <w:t>“errorMessage”: “INJECTEDbyMK”</w:t>
@@ -1403,15 +1320,13 @@
         <w:rPr>
           <w:rFonts w:ascii="Times New Roman" w:eastAsia="Times New Roman" w:hAnsi="Times New Roman" w:cs="Times New Roman"/>
           <w:kern w:val="0"/>
-          <w:lang/>
-          <w14:ligatures w14:val="none"/>
-        </w:rPr>
-      </w:pPr>
-      <w:r>
-        <w:rPr>
-          <w:rFonts w:ascii="Times New Roman" w:eastAsia="Times New Roman" w:hAnsi="Times New Roman" w:cs="Times New Roman"/>
-          <w:kern w:val="0"/>
-          <w:lang/>
+          <w14:ligatures w14:val="none"/>
+        </w:rPr>
+      </w:pPr>
+      <w:r>
+        <w:rPr>
+          <w:rFonts w:ascii="Times New Roman" w:eastAsia="Times New Roman" w:hAnsi="Times New Roman" w:cs="Times New Roman"/>
+          <w:kern w:val="0"/>
           <w14:ligatures w14:val="none"/>
         </w:rPr>
         <w:t>This message originates directly from the injected payload, proving that the function defined in the request body was executed by the backend.</w:t>
@@ -1423,15 +1338,13 @@
         <w:rPr>
           <w:rFonts w:ascii="Times New Roman" w:eastAsia="Times New Roman" w:hAnsi="Times New Roman" w:cs="Times New Roman"/>
           <w:kern w:val="0"/>
-          <w:lang/>
-          <w14:ligatures w14:val="none"/>
-        </w:rPr>
-      </w:pPr>
-      <w:r>
-        <w:rPr>
-          <w:rFonts w:ascii="Times New Roman" w:eastAsia="Times New Roman" w:hAnsi="Times New Roman" w:cs="Times New Roman"/>
-          <w:kern w:val="0"/>
-          <w:lang/>
+          <w14:ligatures w14:val="none"/>
+        </w:rPr>
+      </w:pPr>
+      <w:r>
+        <w:rPr>
+          <w:rFonts w:ascii="Times New Roman" w:eastAsia="Times New Roman" w:hAnsi="Times New Roman" w:cs="Times New Roman"/>
+          <w:kern w:val="0"/>
           <w14:ligatures w14:val="none"/>
         </w:rPr>
         <w:t>Additionally:</w:t>
@@ -1447,15 +1360,13 @@
         <w:rPr>
           <w:rFonts w:ascii="Times New Roman" w:eastAsia="Times New Roman" w:hAnsi="Times New Roman" w:cs="Times New Roman"/>
           <w:kern w:val="0"/>
-          <w:lang/>
-          <w14:ligatures w14:val="none"/>
-        </w:rPr>
-      </w:pPr>
-      <w:r>
-        <w:rPr>
-          <w:rFonts w:ascii="Times New Roman" w:eastAsia="Times New Roman" w:hAnsi="Times New Roman" w:cs="Times New Roman"/>
-          <w:kern w:val="0"/>
-          <w:lang/>
+          <w14:ligatures w14:val="none"/>
+        </w:rPr>
+      </w:pPr>
+      <w:r>
+        <w:rPr>
+          <w:rFonts w:ascii="Times New Roman" w:eastAsia="Times New Roman" w:hAnsi="Times New Roman" w:cs="Times New Roman"/>
+          <w:kern w:val="0"/>
           <w14:ligatures w14:val="none"/>
         </w:rPr>
         <w:t>A normal request returns a valid response</w:t>
@@ -1471,15 +1382,13 @@
         <w:rPr>
           <w:rFonts w:ascii="Times New Roman" w:eastAsia="Times New Roman" w:hAnsi="Times New Roman" w:cs="Times New Roman"/>
           <w:kern w:val="0"/>
-          <w:lang/>
-          <w14:ligatures w14:val="none"/>
-        </w:rPr>
-      </w:pPr>
-      <w:r>
-        <w:rPr>
-          <w:rFonts w:ascii="Times New Roman" w:eastAsia="Times New Roman" w:hAnsi="Times New Roman" w:cs="Times New Roman"/>
-          <w:kern w:val="0"/>
-          <w:lang/>
+          <w14:ligatures w14:val="none"/>
+        </w:rPr>
+      </w:pPr>
+      <w:r>
+        <w:rPr>
+          <w:rFonts w:ascii="Times New Roman" w:eastAsia="Times New Roman" w:hAnsi="Times New Roman" w:cs="Times New Roman"/>
+          <w:kern w:val="0"/>
           <w14:ligatures w14:val="none"/>
         </w:rPr>
         <w:t>The malicious request causes a backend failure</w:t>
@@ -1495,15 +1404,13 @@
         <w:rPr>
           <w:rFonts w:ascii="Times New Roman" w:eastAsia="Times New Roman" w:hAnsi="Times New Roman" w:cs="Times New Roman"/>
           <w:kern w:val="0"/>
-          <w:lang/>
-          <w14:ligatures w14:val="none"/>
-        </w:rPr>
-      </w:pPr>
-      <w:r>
-        <w:rPr>
-          <w:rFonts w:ascii="Times New Roman" w:eastAsia="Times New Roman" w:hAnsi="Times New Roman" w:cs="Times New Roman"/>
-          <w:kern w:val="0"/>
-          <w:lang/>
+          <w14:ligatures w14:val="none"/>
+        </w:rPr>
+      </w:pPr>
+      <w:r>
+        <w:rPr>
+          <w:rFonts w:ascii="Times New Roman" w:eastAsia="Times New Roman" w:hAnsi="Times New Roman" w:cs="Times New Roman"/>
+          <w:kern w:val="0"/>
           <w14:ligatures w14:val="none"/>
         </w:rPr>
         <w:t>The injected error message appears in CloudWatch logs</w:t>
@@ -1515,26 +1422,23 @@
         <w:rPr>
           <w:rFonts w:ascii="Times New Roman" w:eastAsia="Times New Roman" w:hAnsi="Times New Roman" w:cs="Times New Roman"/>
           <w:kern w:val="0"/>
-          <w:lang/>
-          <w14:ligatures w14:val="none"/>
-        </w:rPr>
-      </w:pPr>
-    </w:p>
-    <w:p>
-      <w:pPr>
-        <w:spacing w:before="100" w:beforeAutospacing="1" w:after="100" w:afterAutospacing="1" w:line="240" w:lineRule="auto"/>
-        <w:rPr>
-          <w:rFonts w:ascii="Times New Roman" w:eastAsia="Times New Roman" w:hAnsi="Times New Roman" w:cs="Times New Roman"/>
-          <w:kern w:val="0"/>
-          <w:lang/>
-          <w14:ligatures w14:val="none"/>
-        </w:rPr>
-      </w:pPr>
-      <w:r>
-        <w:rPr>
-          <w:rFonts w:ascii="Times New Roman" w:eastAsia="Times New Roman" w:hAnsi="Times New Roman" w:cs="Times New Roman"/>
-          <w:kern w:val="0"/>
-          <w:lang/>
+          <w14:ligatures w14:val="none"/>
+        </w:rPr>
+      </w:pPr>
+    </w:p>
+    <w:p>
+      <w:pPr>
+        <w:spacing w:before="100" w:beforeAutospacing="1" w:after="100" w:afterAutospacing="1" w:line="240" w:lineRule="auto"/>
+        <w:rPr>
+          <w:rFonts w:ascii="Times New Roman" w:eastAsia="Times New Roman" w:hAnsi="Times New Roman" w:cs="Times New Roman"/>
+          <w:kern w:val="0"/>
+          <w14:ligatures w14:val="none"/>
+        </w:rPr>
+      </w:pPr>
+      <w:r>
+        <w:rPr>
+          <w:rFonts w:ascii="Times New Roman" w:eastAsia="Times New Roman" w:hAnsi="Times New Roman" w:cs="Times New Roman"/>
+          <w:kern w:val="0"/>
           <w14:ligatures w14:val="none"/>
         </w:rPr>
         <w:t>The exploit is further validated by the fact that the injected payload produced a controlled and predictable error message inside the Lambda execution environment. The appearance of the exact attacker-defined string confirms that the backend interpreted user input as executable code rather than plain data.</w:t>
@@ -1543,7 +1447,6 @@
         <w:rPr>
           <w:rFonts w:ascii="Times New Roman" w:eastAsia="Times New Roman" w:hAnsi="Times New Roman" w:cs="Times New Roman"/>
           <w:kern w:val="0"/>
-          <w:lang/>
           <w14:ligatures w14:val="none"/>
         </w:rPr>
         <w:t xml:space="preserve"> </w:t>
@@ -1552,7 +1455,6 @@
         <w:rPr>
           <w:rFonts w:ascii="Times New Roman" w:eastAsia="Times New Roman" w:hAnsi="Times New Roman" w:cs="Times New Roman"/>
           <w:kern w:val="0"/>
-          <w:lang/>
           <w14:ligatures w14:val="none"/>
         </w:rPr>
         <w:t>This combination of results demonstrates that the backend treats user input as executable content, confirming the presence of an Event Injection vulnerability.</w:t>
@@ -1572,7 +1474,6 @@
           <w:kern w:val="0"/>
           <w:sz w:val="36"/>
           <w:szCs w:val="36"/>
-          <w:lang/>
           <w14:ligatures w14:val="none"/>
         </w:rPr>
       </w:pPr>
@@ -1586,7 +1487,6 @@
           <w:kern w:val="0"/>
           <w:sz w:val="36"/>
           <w:szCs w:val="36"/>
-          <w:lang/>
           <w14:ligatures w14:val="none"/>
         </w:rPr>
         <w:t>Fix Strategy / Probable Mitigation</w:t>
@@ -1598,7 +1498,6 @@
         <w:rPr>
           <w:rFonts w:ascii="Times New Roman" w:eastAsia="Times New Roman" w:hAnsi="Times New Roman" w:cs="Times New Roman"/>
           <w:kern w:val="0"/>
-          <w:lang/>
           <w14:ligatures w14:val="none"/>
         </w:rPr>
       </w:pPr>
@@ -1610,15 +1509,13 @@
         <w:rPr>
           <w:rFonts w:ascii="Times New Roman" w:eastAsia="Times New Roman" w:hAnsi="Times New Roman" w:cs="Times New Roman"/>
           <w:kern w:val="0"/>
-          <w:lang/>
-          <w14:ligatures w14:val="none"/>
-        </w:rPr>
-      </w:pPr>
-      <w:r>
-        <w:rPr>
-          <w:rFonts w:ascii="Times New Roman" w:eastAsia="Times New Roman" w:hAnsi="Times New Roman" w:cs="Times New Roman"/>
-          <w:kern w:val="0"/>
-          <w:lang/>
+          <w14:ligatures w14:val="none"/>
+        </w:rPr>
+      </w:pPr>
+      <w:r>
+        <w:rPr>
+          <w:rFonts w:ascii="Times New Roman" w:eastAsia="Times New Roman" w:hAnsi="Times New Roman" w:cs="Times New Roman"/>
+          <w:kern w:val="0"/>
           <w14:ligatures w14:val="none"/>
         </w:rPr>
         <w:lastRenderedPageBreak/>
@@ -1632,15 +1529,13 @@
         <w:rPr>
           <w:rFonts w:ascii="Times New Roman" w:eastAsia="Times New Roman" w:hAnsi="Times New Roman" w:cs="Times New Roman"/>
           <w:kern w:val="0"/>
-          <w:lang/>
-          <w14:ligatures w14:val="none"/>
-        </w:rPr>
-      </w:pPr>
-      <w:r>
-        <w:rPr>
-          <w:rFonts w:ascii="Times New Roman" w:eastAsia="Times New Roman" w:hAnsi="Times New Roman" w:cs="Times New Roman"/>
-          <w:kern w:val="0"/>
-          <w:lang/>
+          <w14:ligatures w14:val="none"/>
+        </w:rPr>
+      </w:pPr>
+      <w:r>
+        <w:rPr>
+          <w:rFonts w:ascii="Times New Roman" w:eastAsia="Times New Roman" w:hAnsi="Times New Roman" w:cs="Times New Roman"/>
+          <w:kern w:val="0"/>
           <w14:ligatures w14:val="none"/>
         </w:rPr>
         <w:t>Instead, request bodies should be treated strictly as JSON and parsed using safe methods such as JSON.parse. Additionally, all input fields should be validated against an allowlist to ensure that only expected data types and formats are accepted.</w:t>
@@ -1660,7 +1555,6 @@
         <w:rPr>
           <w:rFonts w:ascii="Times New Roman" w:eastAsia="Times New Roman" w:hAnsi="Times New Roman" w:cs="Times New Roman"/>
           <w:kern w:val="0"/>
-          <w:lang/>
           <w14:ligatures w14:val="none"/>
         </w:rPr>
         <w:t>The backend should also enforce strict separation between data and executable logic, ensuring that user input cannot influence code execution in any way.</w:t>
@@ -1669,7 +1563,6 @@
         <w:rPr>
           <w:rFonts w:ascii="Times New Roman" w:eastAsia="Times New Roman" w:hAnsi="Times New Roman" w:cs="Times New Roman"/>
           <w:kern w:val="0"/>
-          <w:lang/>
           <w14:ligatures w14:val="none"/>
         </w:rPr>
         <w:t xml:space="preserve"> </w:t>
@@ -1678,7 +1571,6 @@
         <w:rPr>
           <w:rFonts w:ascii="Times New Roman" w:eastAsia="Times New Roman" w:hAnsi="Times New Roman" w:cs="Times New Roman"/>
           <w:kern w:val="0"/>
-          <w:lang/>
           <w14:ligatures w14:val="none"/>
         </w:rPr>
         <w:t>In addition, dependency-level security must be considered, as the use of vulnerable libraries such as node-serialize introduces systemic risks. Replacing such libraries with secure alternatives is essential.</w:t>
@@ -1742,7 +1634,6 @@
         <w:rPr>
           <w:rFonts w:ascii="Times New Roman" w:eastAsia="Times New Roman" w:hAnsi="Times New Roman" w:cs="Times New Roman"/>
           <w:kern w:val="0"/>
-          <w:lang/>
           <w14:ligatures w14:val="none"/>
         </w:rPr>
       </w:pPr>
@@ -1751,10 +1642,9 @@
           <w:rFonts w:ascii="Times New Roman" w:eastAsia="Times New Roman" w:hAnsi="Times New Roman" w:cs="Times New Roman"/>
           <w:noProof/>
           <w:kern w:val="0"/>
-          <w:lang/>
         </w:rPr>
         <w:pict w14:anchorId="17AA1A32">
-          <v:rect id="_x0000_i1032" alt="" style="width:468pt;height:.05pt;mso-width-percent:0;mso-height-percent:0;mso-width-percent:0;mso-height-percent:0" o:hralign="center" o:hrstd="t" o:hr="t" fillcolor="#a0a0a0" stroked="f"/>
+          <v:rect id="_x0000_i1033" alt="" style="width:468pt;height:.05pt;mso-width-percent:0;mso-height-percent:0;mso-width-percent:0;mso-height-percent:0" o:hralign="center" o:hrstd="t" o:hr="t" fillcolor="#a0a0a0" stroked="f"/>
         </w:pict>
       </w:r>
     </w:p>
@@ -1772,7 +1662,6 @@
           <w:kern w:val="0"/>
           <w:sz w:val="36"/>
           <w:szCs w:val="36"/>
-          <w:lang/>
           <w14:ligatures w14:val="none"/>
         </w:rPr>
       </w:pPr>
@@ -1786,7 +1675,6 @@
           <w:kern w:val="0"/>
           <w:sz w:val="36"/>
           <w:szCs w:val="36"/>
-          <w:lang/>
           <w14:ligatures w14:val="none"/>
         </w:rPr>
         <w:t>Code / Config Changes</w:t>
@@ -1798,26 +1686,23 @@
         <w:rPr>
           <w:rFonts w:ascii="Times New Roman" w:eastAsia="Times New Roman" w:hAnsi="Times New Roman" w:cs="Times New Roman"/>
           <w:kern w:val="0"/>
-          <w:lang/>
-          <w14:ligatures w14:val="none"/>
-        </w:rPr>
-      </w:pPr>
-    </w:p>
-    <w:p>
-      <w:pPr>
-        <w:spacing w:before="100" w:beforeAutospacing="1" w:after="100" w:afterAutospacing="1" w:line="240" w:lineRule="auto"/>
-        <w:rPr>
-          <w:rFonts w:ascii="Times New Roman" w:eastAsia="Times New Roman" w:hAnsi="Times New Roman" w:cs="Times New Roman"/>
-          <w:kern w:val="0"/>
-          <w:lang/>
-          <w14:ligatures w14:val="none"/>
-        </w:rPr>
-      </w:pPr>
-      <w:r>
-        <w:rPr>
-          <w:rFonts w:ascii="Times New Roman" w:eastAsia="Times New Roman" w:hAnsi="Times New Roman" w:cs="Times New Roman"/>
-          <w:kern w:val="0"/>
-          <w:lang/>
+          <w14:ligatures w14:val="none"/>
+        </w:rPr>
+      </w:pPr>
+    </w:p>
+    <w:p>
+      <w:pPr>
+        <w:spacing w:before="100" w:beforeAutospacing="1" w:after="100" w:afterAutospacing="1" w:line="240" w:lineRule="auto"/>
+        <w:rPr>
+          <w:rFonts w:ascii="Times New Roman" w:eastAsia="Times New Roman" w:hAnsi="Times New Roman" w:cs="Times New Roman"/>
+          <w:kern w:val="0"/>
+          <w14:ligatures w14:val="none"/>
+        </w:rPr>
+      </w:pPr>
+      <w:r>
+        <w:rPr>
+          <w:rFonts w:ascii="Times New Roman" w:eastAsia="Times New Roman" w:hAnsi="Times New Roman" w:cs="Times New Roman"/>
+          <w:kern w:val="0"/>
           <w14:ligatures w14:val="none"/>
         </w:rPr>
         <w:t>To fix the vulnerability, the request-processing logic in the AWS Lambda function was modified to remove the use of node-serialize for handling request data.</w:t>
@@ -1829,26 +1714,23 @@
         <w:rPr>
           <w:rFonts w:ascii="Times New Roman" w:eastAsia="Times New Roman" w:hAnsi="Times New Roman" w:cs="Times New Roman"/>
           <w:kern w:val="0"/>
-          <w:lang/>
-          <w14:ligatures w14:val="none"/>
-        </w:rPr>
-      </w:pPr>
-    </w:p>
-    <w:p>
-      <w:pPr>
-        <w:spacing w:before="100" w:beforeAutospacing="1" w:after="100" w:afterAutospacing="1" w:line="240" w:lineRule="auto"/>
-        <w:rPr>
-          <w:rFonts w:ascii="Times New Roman" w:eastAsia="Times New Roman" w:hAnsi="Times New Roman" w:cs="Times New Roman"/>
-          <w:kern w:val="0"/>
-          <w:lang/>
-          <w14:ligatures w14:val="none"/>
-        </w:rPr>
-      </w:pPr>
-      <w:r>
-        <w:rPr>
-          <w:rFonts w:ascii="Times New Roman" w:eastAsia="Times New Roman" w:hAnsi="Times New Roman" w:cs="Times New Roman"/>
-          <w:kern w:val="0"/>
-          <w:lang/>
+          <w14:ligatures w14:val="none"/>
+        </w:rPr>
+      </w:pPr>
+    </w:p>
+    <w:p>
+      <w:pPr>
+        <w:spacing w:before="100" w:beforeAutospacing="1" w:after="100" w:afterAutospacing="1" w:line="240" w:lineRule="auto"/>
+        <w:rPr>
+          <w:rFonts w:ascii="Times New Roman" w:eastAsia="Times New Roman" w:hAnsi="Times New Roman" w:cs="Times New Roman"/>
+          <w:kern w:val="0"/>
+          <w14:ligatures w14:val="none"/>
+        </w:rPr>
+      </w:pPr>
+      <w:r>
+        <w:rPr>
+          <w:rFonts w:ascii="Times New Roman" w:eastAsia="Times New Roman" w:hAnsi="Times New Roman" w:cs="Times New Roman"/>
+          <w:kern w:val="0"/>
           <w14:ligatures w14:val="none"/>
         </w:rPr>
         <w:t>Before the fix, the application used:</w:t>
@@ -1860,15 +1742,13 @@
         <w:rPr>
           <w:rFonts w:ascii="Times New Roman" w:eastAsia="Times New Roman" w:hAnsi="Times New Roman" w:cs="Times New Roman"/>
           <w:kern w:val="0"/>
-          <w:lang/>
-          <w14:ligatures w14:val="none"/>
-        </w:rPr>
-      </w:pPr>
-      <w:r>
-        <w:rPr>
-          <w:rFonts w:ascii="Times New Roman" w:eastAsia="Times New Roman" w:hAnsi="Times New Roman" w:cs="Times New Roman"/>
-          <w:kern w:val="0"/>
-          <w:lang/>
+          <w14:ligatures w14:val="none"/>
+        </w:rPr>
+      </w:pPr>
+      <w:r>
+        <w:rPr>
+          <w:rFonts w:ascii="Times New Roman" w:eastAsia="Times New Roman" w:hAnsi="Times New Roman" w:cs="Times New Roman"/>
+          <w:kern w:val="0"/>
           <w14:ligatures w14:val="none"/>
         </w:rPr>
         <w:t>var req = serialize.unserialize(event.body);</w:t>
@@ -1880,15 +1760,13 @@
         <w:rPr>
           <w:rFonts w:ascii="Times New Roman" w:eastAsia="Times New Roman" w:hAnsi="Times New Roman" w:cs="Times New Roman"/>
           <w:kern w:val="0"/>
-          <w:lang/>
-          <w14:ligatures w14:val="none"/>
-        </w:rPr>
-      </w:pPr>
-      <w:r>
-        <w:rPr>
-          <w:rFonts w:ascii="Times New Roman" w:eastAsia="Times New Roman" w:hAnsi="Times New Roman" w:cs="Times New Roman"/>
-          <w:kern w:val="0"/>
-          <w:lang/>
+          <w14:ligatures w14:val="none"/>
+        </w:rPr>
+      </w:pPr>
+      <w:r>
+        <w:rPr>
+          <w:rFonts w:ascii="Times New Roman" w:eastAsia="Times New Roman" w:hAnsi="Times New Roman" w:cs="Times New Roman"/>
+          <w:kern w:val="0"/>
           <w14:ligatures w14:val="none"/>
         </w:rPr>
         <w:t>var headers = serialize.unserialize(event.headers);</w:t>
@@ -1900,7 +1778,6 @@
         <w:rPr>
           <w:rFonts w:ascii="Times New Roman" w:eastAsia="Times New Roman" w:hAnsi="Times New Roman" w:cs="Times New Roman"/>
           <w:kern w:val="0"/>
-          <w:lang/>
           <w14:ligatures w14:val="none"/>
         </w:rPr>
       </w:pPr>
@@ -1909,7 +1786,6 @@
           <w:rFonts w:ascii="Times New Roman" w:eastAsia="Times New Roman" w:hAnsi="Times New Roman" w:cs="Times New Roman"/>
           <w:noProof/>
           <w:kern w:val="0"/>
-          <w:lang/>
           <w14:ligatures w14:val="none"/>
         </w:rPr>
         <w:drawing>
@@ -1955,7 +1831,6 @@
         <w:rPr>
           <w:rFonts w:ascii="Times New Roman" w:eastAsia="Times New Roman" w:hAnsi="Times New Roman" w:cs="Times New Roman"/>
           <w:kern w:val="0"/>
-          <w:lang/>
           <w14:ligatures w14:val="none"/>
         </w:rPr>
       </w:pPr>
@@ -1964,10 +1839,9 @@
           <w:rFonts w:ascii="Times New Roman" w:eastAsia="Times New Roman" w:hAnsi="Times New Roman" w:cs="Times New Roman"/>
           <w:noProof/>
           <w:kern w:val="0"/>
-          <w:lang/>
         </w:rPr>
         <w:pict w14:anchorId="73BBBDA3">
-          <v:rect id="_x0000_i1033" alt="" style="width:468pt;height:.05pt;mso-width-percent:0;mso-height-percent:0;mso-width-percent:0;mso-height-percent:0" o:hralign="center" o:hrstd="t" o:hr="t" fillcolor="#a0a0a0" stroked="f"/>
+          <v:rect id="_x0000_i1032" alt="" style="width:468pt;height:.05pt;mso-width-percent:0;mso-height-percent:0;mso-width-percent:0;mso-height-percent:0" o:hralign="center" o:hrstd="t" o:hr="t" fillcolor="#a0a0a0" stroked="f"/>
         </w:pict>
       </w:r>
     </w:p>
@@ -1977,26 +1851,23 @@
         <w:rPr>
           <w:rFonts w:ascii="Times New Roman" w:eastAsia="Times New Roman" w:hAnsi="Times New Roman" w:cs="Times New Roman"/>
           <w:kern w:val="0"/>
-          <w:lang/>
-          <w14:ligatures w14:val="none"/>
-        </w:rPr>
-      </w:pPr>
-    </w:p>
-    <w:p>
-      <w:pPr>
-        <w:spacing w:before="100" w:beforeAutospacing="1" w:after="100" w:afterAutospacing="1" w:line="240" w:lineRule="auto"/>
-        <w:rPr>
-          <w:rFonts w:ascii="Times New Roman" w:eastAsia="Times New Roman" w:hAnsi="Times New Roman" w:cs="Times New Roman"/>
-          <w:kern w:val="0"/>
-          <w:lang/>
-          <w14:ligatures w14:val="none"/>
-        </w:rPr>
-      </w:pPr>
-      <w:r>
-        <w:rPr>
-          <w:rFonts w:ascii="Times New Roman" w:eastAsia="Times New Roman" w:hAnsi="Times New Roman" w:cs="Times New Roman"/>
-          <w:kern w:val="0"/>
-          <w:lang/>
+          <w14:ligatures w14:val="none"/>
+        </w:rPr>
+      </w:pPr>
+    </w:p>
+    <w:p>
+      <w:pPr>
+        <w:spacing w:before="100" w:beforeAutospacing="1" w:after="100" w:afterAutospacing="1" w:line="240" w:lineRule="auto"/>
+        <w:rPr>
+          <w:rFonts w:ascii="Times New Roman" w:eastAsia="Times New Roman" w:hAnsi="Times New Roman" w:cs="Times New Roman"/>
+          <w:kern w:val="0"/>
+          <w14:ligatures w14:val="none"/>
+        </w:rPr>
+      </w:pPr>
+      <w:r>
+        <w:rPr>
+          <w:rFonts w:ascii="Times New Roman" w:eastAsia="Times New Roman" w:hAnsi="Times New Roman" w:cs="Times New Roman"/>
+          <w:kern w:val="0"/>
           <w14:ligatures w14:val="none"/>
         </w:rPr>
         <w:t>After the fix, this logic was replaced with safe JSON parsing:</w:t>
@@ -2008,15 +1879,13 @@
         <w:rPr>
           <w:rFonts w:ascii="Times New Roman" w:eastAsia="Times New Roman" w:hAnsi="Times New Roman" w:cs="Times New Roman"/>
           <w:kern w:val="0"/>
-          <w:lang/>
-          <w14:ligatures w14:val="none"/>
-        </w:rPr>
-      </w:pPr>
-      <w:r>
-        <w:rPr>
-          <w:rFonts w:ascii="Times New Roman" w:eastAsia="Times New Roman" w:hAnsi="Times New Roman" w:cs="Times New Roman"/>
-          <w:kern w:val="0"/>
-          <w:lang/>
+          <w14:ligatures w14:val="none"/>
+        </w:rPr>
+      </w:pPr>
+      <w:r>
+        <w:rPr>
+          <w:rFonts w:ascii="Times New Roman" w:eastAsia="Times New Roman" w:hAnsi="Times New Roman" w:cs="Times New Roman"/>
+          <w:kern w:val="0"/>
           <w14:ligatures w14:val="none"/>
         </w:rPr>
         <w:t>const req = JSON.parse(event.body || “{}”);</w:t>
@@ -2028,15 +1897,13 @@
         <w:rPr>
           <w:rFonts w:ascii="Times New Roman" w:eastAsia="Times New Roman" w:hAnsi="Times New Roman" w:cs="Times New Roman"/>
           <w:kern w:val="0"/>
-          <w:lang/>
-          <w14:ligatures w14:val="none"/>
-        </w:rPr>
-      </w:pPr>
-      <w:r>
-        <w:rPr>
-          <w:rFonts w:ascii="Times New Roman" w:eastAsia="Times New Roman" w:hAnsi="Times New Roman" w:cs="Times New Roman"/>
-          <w:kern w:val="0"/>
-          <w:lang/>
+          <w14:ligatures w14:val="none"/>
+        </w:rPr>
+      </w:pPr>
+      <w:r>
+        <w:rPr>
+          <w:rFonts w:ascii="Times New Roman" w:eastAsia="Times New Roman" w:hAnsi="Times New Roman" w:cs="Times New Roman"/>
+          <w:kern w:val="0"/>
           <w14:ligatures w14:val="none"/>
         </w:rPr>
         <w:lastRenderedPageBreak/>
@@ -2049,7 +1916,6 @@
         <w:rPr>
           <w:rFonts w:ascii="Times New Roman" w:eastAsia="Times New Roman" w:hAnsi="Times New Roman" w:cs="Times New Roman"/>
           <w:kern w:val="0"/>
-          <w:lang/>
           <w14:ligatures w14:val="none"/>
         </w:rPr>
       </w:pPr>
@@ -2060,7 +1926,6 @@
         <w:rPr>
           <w:rFonts w:ascii="Times New Roman" w:eastAsia="Times New Roman" w:hAnsi="Times New Roman" w:cs="Times New Roman"/>
           <w:kern w:val="0"/>
-          <w:lang/>
           <w14:ligatures w14:val="none"/>
         </w:rPr>
       </w:pPr>
@@ -2069,7 +1934,6 @@
           <w:rFonts w:ascii="Apple Color Emoji" w:eastAsia="Times New Roman" w:hAnsi="Apple Color Emoji" w:cs="Apple Color Emoji"/>
           <w:noProof/>
           <w:kern w:val="0"/>
-          <w:lang/>
           <w14:ligatures w14:val="none"/>
         </w:rPr>
         <w:drawing>
@@ -2115,15 +1979,13 @@
         <w:rPr>
           <w:rFonts w:ascii="Times New Roman" w:eastAsia="Times New Roman" w:hAnsi="Times New Roman" w:cs="Times New Roman"/>
           <w:kern w:val="0"/>
-          <w:lang/>
-          <w14:ligatures w14:val="none"/>
-        </w:rPr>
-      </w:pPr>
-      <w:r>
-        <w:rPr>
-          <w:rFonts w:ascii="Times New Roman" w:eastAsia="Times New Roman" w:hAnsi="Times New Roman" w:cs="Times New Roman"/>
-          <w:kern w:val="0"/>
-          <w:lang/>
+          <w14:ligatures w14:val="none"/>
+        </w:rPr>
+      </w:pPr>
+      <w:r>
+        <w:rPr>
+          <w:rFonts w:ascii="Times New Roman" w:eastAsia="Times New Roman" w:hAnsi="Times New Roman" w:cs="Times New Roman"/>
+          <w:kern w:val="0"/>
           <w14:ligatures w14:val="none"/>
         </w:rPr>
         <w:t>The main logic changes were:</w:t>
@@ -2139,15 +2001,13 @@
         <w:rPr>
           <w:rFonts w:ascii="Times New Roman" w:eastAsia="Times New Roman" w:hAnsi="Times New Roman" w:cs="Times New Roman"/>
           <w:kern w:val="0"/>
-          <w:lang/>
-          <w14:ligatures w14:val="none"/>
-        </w:rPr>
-      </w:pPr>
-      <w:r>
-        <w:rPr>
-          <w:rFonts w:ascii="Times New Roman" w:eastAsia="Times New Roman" w:hAnsi="Times New Roman" w:cs="Times New Roman"/>
-          <w:kern w:val="0"/>
-          <w:lang/>
+          <w14:ligatures w14:val="none"/>
+        </w:rPr>
+      </w:pPr>
+      <w:r>
+        <w:rPr>
+          <w:rFonts w:ascii="Times New Roman" w:eastAsia="Times New Roman" w:hAnsi="Times New Roman" w:cs="Times New Roman"/>
+          <w:kern w:val="0"/>
           <w14:ligatures w14:val="none"/>
         </w:rPr>
         <w:t>Removing unsafe deserialization using node-serialize</w:t>
@@ -2163,15 +2023,13 @@
         <w:rPr>
           <w:rFonts w:ascii="Times New Roman" w:eastAsia="Times New Roman" w:hAnsi="Times New Roman" w:cs="Times New Roman"/>
           <w:kern w:val="0"/>
-          <w:lang/>
-          <w14:ligatures w14:val="none"/>
-        </w:rPr>
-      </w:pPr>
-      <w:r>
-        <w:rPr>
-          <w:rFonts w:ascii="Times New Roman" w:eastAsia="Times New Roman" w:hAnsi="Times New Roman" w:cs="Times New Roman"/>
-          <w:kern w:val="0"/>
-          <w:lang/>
+          <w14:ligatures w14:val="none"/>
+        </w:rPr>
+      </w:pPr>
+      <w:r>
+        <w:rPr>
+          <w:rFonts w:ascii="Times New Roman" w:eastAsia="Times New Roman" w:hAnsi="Times New Roman" w:cs="Times New Roman"/>
+          <w:kern w:val="0"/>
           <w14:ligatures w14:val="none"/>
         </w:rPr>
         <w:t>Treating request data strictly as JSON</w:t>
@@ -2187,15 +2045,13 @@
         <w:rPr>
           <w:rFonts w:ascii="Times New Roman" w:eastAsia="Times New Roman" w:hAnsi="Times New Roman" w:cs="Times New Roman"/>
           <w:kern w:val="0"/>
-          <w:lang/>
-          <w14:ligatures w14:val="none"/>
-        </w:rPr>
-      </w:pPr>
-      <w:r>
-        <w:rPr>
-          <w:rFonts w:ascii="Times New Roman" w:eastAsia="Times New Roman" w:hAnsi="Times New Roman" w:cs="Times New Roman"/>
-          <w:kern w:val="0"/>
-          <w:lang/>
+          <w14:ligatures w14:val="none"/>
+        </w:rPr>
+      </w:pPr>
+      <w:r>
+        <w:rPr>
+          <w:rFonts w:ascii="Times New Roman" w:eastAsia="Times New Roman" w:hAnsi="Times New Roman" w:cs="Times New Roman"/>
+          <w:kern w:val="0"/>
           <w14:ligatures w14:val="none"/>
         </w:rPr>
         <w:t>Preventing execution of user-controlled content</w:t>
@@ -2207,7 +2063,6 @@
         <w:rPr>
           <w:rFonts w:ascii="Times New Roman" w:eastAsia="Times New Roman" w:hAnsi="Times New Roman" w:cs="Times New Roman"/>
           <w:kern w:val="0"/>
-          <w:lang/>
           <w14:ligatures w14:val="none"/>
         </w:rPr>
       </w:pPr>
@@ -2216,10 +2071,9 @@
           <w:rFonts w:ascii="Times New Roman" w:eastAsia="Times New Roman" w:hAnsi="Times New Roman" w:cs="Times New Roman"/>
           <w:noProof/>
           <w:kern w:val="0"/>
-          <w:lang/>
         </w:rPr>
         <w:pict w14:anchorId="00C5A4C7">
-          <v:rect id="_x0000_i1034" alt="" style="width:468pt;height:.05pt;mso-width-percent:0;mso-height-percent:0;mso-width-percent:0;mso-height-percent:0" o:hralign="center" o:hrstd="t" o:hr="t" fillcolor="#a0a0a0" stroked="f"/>
+          <v:rect id="_x0000_i1031" alt="" style="width:468pt;height:.05pt;mso-width-percent:0;mso-height-percent:0;mso-width-percent:0;mso-height-percent:0" o:hralign="center" o:hrstd="t" o:hr="t" fillcolor="#a0a0a0" stroked="f"/>
         </w:pict>
       </w:r>
     </w:p>
@@ -2237,7 +2091,6 @@
           <w:kern w:val="0"/>
           <w:sz w:val="36"/>
           <w:szCs w:val="36"/>
-          <w:lang/>
           <w14:ligatures w14:val="none"/>
         </w:rPr>
       </w:pPr>
@@ -2251,7 +2104,6 @@
           <w:kern w:val="0"/>
           <w:sz w:val="36"/>
           <w:szCs w:val="36"/>
-          <w:lang/>
           <w14:ligatures w14:val="none"/>
         </w:rPr>
         <w:t>Verification After Fix</w:t>
@@ -2263,26 +2115,23 @@
         <w:rPr>
           <w:rFonts w:ascii="Times New Roman" w:eastAsia="Times New Roman" w:hAnsi="Times New Roman" w:cs="Times New Roman"/>
           <w:kern w:val="0"/>
-          <w:lang/>
-          <w14:ligatures w14:val="none"/>
-        </w:rPr>
-      </w:pPr>
-    </w:p>
-    <w:p>
-      <w:pPr>
-        <w:spacing w:before="100" w:beforeAutospacing="1" w:after="100" w:afterAutospacing="1" w:line="240" w:lineRule="auto"/>
-        <w:rPr>
-          <w:rFonts w:ascii="Times New Roman" w:eastAsia="Times New Roman" w:hAnsi="Times New Roman" w:cs="Times New Roman"/>
-          <w:kern w:val="0"/>
-          <w:lang/>
-          <w14:ligatures w14:val="none"/>
-        </w:rPr>
-      </w:pPr>
-      <w:r>
-        <w:rPr>
-          <w:rFonts w:ascii="Times New Roman" w:eastAsia="Times New Roman" w:hAnsi="Times New Roman" w:cs="Times New Roman"/>
-          <w:kern w:val="0"/>
-          <w:lang/>
+          <w14:ligatures w14:val="none"/>
+        </w:rPr>
+      </w:pPr>
+    </w:p>
+    <w:p>
+      <w:pPr>
+        <w:spacing w:before="100" w:beforeAutospacing="1" w:after="100" w:afterAutospacing="1" w:line="240" w:lineRule="auto"/>
+        <w:rPr>
+          <w:rFonts w:ascii="Times New Roman" w:eastAsia="Times New Roman" w:hAnsi="Times New Roman" w:cs="Times New Roman"/>
+          <w:kern w:val="0"/>
+          <w14:ligatures w14:val="none"/>
+        </w:rPr>
+      </w:pPr>
+      <w:r>
+        <w:rPr>
+          <w:rFonts w:ascii="Times New Roman" w:eastAsia="Times New Roman" w:hAnsi="Times New Roman" w:cs="Times New Roman"/>
+          <w:kern w:val="0"/>
           <w14:ligatures w14:val="none"/>
         </w:rPr>
         <w:t>After applying the fix, the same exploit payload was sent again:</w:t>
@@ -2294,15 +2143,13 @@
         <w:rPr>
           <w:rFonts w:ascii="Times New Roman" w:eastAsia="Times New Roman" w:hAnsi="Times New Roman" w:cs="Times New Roman"/>
           <w:kern w:val="0"/>
-          <w:lang/>
-          <w14:ligatures w14:val="none"/>
-        </w:rPr>
-      </w:pPr>
-      <w:r>
-        <w:rPr>
-          <w:rFonts w:ascii="Times New Roman" w:eastAsia="Times New Roman" w:hAnsi="Times New Roman" w:cs="Times New Roman"/>
-          <w:kern w:val="0"/>
-          <w:lang/>
+          <w14:ligatures w14:val="none"/>
+        </w:rPr>
+      </w:pPr>
+      <w:r>
+        <w:rPr>
+          <w:rFonts w:ascii="Times New Roman" w:eastAsia="Times New Roman" w:hAnsi="Times New Roman" w:cs="Times New Roman"/>
+          <w:kern w:val="0"/>
           <w14:ligatures w14:val="none"/>
         </w:rPr>
         <w:t>{</w:t>
@@ -2314,15 +2161,13 @@
         <w:rPr>
           <w:rFonts w:ascii="Times New Roman" w:eastAsia="Times New Roman" w:hAnsi="Times New Roman" w:cs="Times New Roman"/>
           <w:kern w:val="0"/>
-          <w:lang/>
-          <w14:ligatures w14:val="none"/>
-        </w:rPr>
-      </w:pPr>
-      <w:r>
-        <w:rPr>
-          <w:rFonts w:ascii="Times New Roman" w:eastAsia="Times New Roman" w:hAnsi="Times New Roman" w:cs="Times New Roman"/>
-          <w:kern w:val="0"/>
-          <w:lang/>
+          <w14:ligatures w14:val="none"/>
+        </w:rPr>
+      </w:pPr>
+      <w:r>
+        <w:rPr>
+          <w:rFonts w:ascii="Times New Roman" w:eastAsia="Times New Roman" w:hAnsi="Times New Roman" w:cs="Times New Roman"/>
+          <w:kern w:val="0"/>
           <w14:ligatures w14:val="none"/>
         </w:rPr>
         <w:t>“action”: “orders”,</w:t>
@@ -2334,15 +2179,13 @@
         <w:rPr>
           <w:rFonts w:ascii="Times New Roman" w:eastAsia="Times New Roman" w:hAnsi="Times New Roman" w:cs="Times New Roman"/>
           <w:kern w:val="0"/>
-          <w:lang/>
-          <w14:ligatures w14:val="none"/>
-        </w:rPr>
-      </w:pPr>
-      <w:r>
-        <w:rPr>
-          <w:rFonts w:ascii="Times New Roman" w:eastAsia="Times New Roman" w:hAnsi="Times New Roman" w:cs="Times New Roman"/>
-          <w:kern w:val="0"/>
-          <w:lang/>
+          <w14:ligatures w14:val="none"/>
+        </w:rPr>
+      </w:pPr>
+      <w:r>
+        <w:rPr>
+          <w:rFonts w:ascii="Times New Roman" w:eastAsia="Times New Roman" w:hAnsi="Times New Roman" w:cs="Times New Roman"/>
+          <w:kern w:val="0"/>
           <w14:ligatures w14:val="none"/>
         </w:rPr>
         <w:t>“test”: “_$$ND_FUNC$$_function(){throw ‘INJECTEDbyMK’}()”</w:t>
@@ -2354,15 +2197,13 @@
         <w:rPr>
           <w:rFonts w:ascii="Times New Roman" w:eastAsia="Times New Roman" w:hAnsi="Times New Roman" w:cs="Times New Roman"/>
           <w:kern w:val="0"/>
-          <w:lang/>
-          <w14:ligatures w14:val="none"/>
-        </w:rPr>
-      </w:pPr>
-      <w:r>
-        <w:rPr>
-          <w:rFonts w:ascii="Times New Roman" w:eastAsia="Times New Roman" w:hAnsi="Times New Roman" w:cs="Times New Roman"/>
-          <w:kern w:val="0"/>
-          <w:lang/>
+          <w14:ligatures w14:val="none"/>
+        </w:rPr>
+      </w:pPr>
+      <w:r>
+        <w:rPr>
+          <w:rFonts w:ascii="Times New Roman" w:eastAsia="Times New Roman" w:hAnsi="Times New Roman" w:cs="Times New Roman"/>
+          <w:kern w:val="0"/>
           <w14:ligatures w14:val="none"/>
         </w:rPr>
         <w:t>}</w:t>
@@ -2374,15 +2215,13 @@
         <w:rPr>
           <w:rFonts w:ascii="Times New Roman" w:eastAsia="Times New Roman" w:hAnsi="Times New Roman" w:cs="Times New Roman"/>
           <w:kern w:val="0"/>
-          <w:lang/>
-          <w14:ligatures w14:val="none"/>
-        </w:rPr>
-      </w:pPr>
-      <w:r>
-        <w:rPr>
-          <w:rFonts w:ascii="Times New Roman" w:eastAsia="Times New Roman" w:hAnsi="Times New Roman" w:cs="Times New Roman"/>
-          <w:kern w:val="0"/>
-          <w:lang/>
+          <w14:ligatures w14:val="none"/>
+        </w:rPr>
+      </w:pPr>
+      <w:r>
+        <w:rPr>
+          <w:rFonts w:ascii="Times New Roman" w:eastAsia="Times New Roman" w:hAnsi="Times New Roman" w:cs="Times New Roman"/>
+          <w:kern w:val="0"/>
           <w14:ligatures w14:val="none"/>
         </w:rPr>
         <w:t>This time, the backend processed the request without executing the payload. The request either returned a normal response or rejected the malformed input without triggering an internal error.</w:t>
@@ -2394,18 +2233,16 @@
         <w:rPr>
           <w:rFonts w:ascii="Times New Roman" w:eastAsia="Times New Roman" w:hAnsi="Times New Roman" w:cs="Times New Roman"/>
           <w:kern w:val="0"/>
-          <w:lang/>
-          <w14:ligatures w14:val="none"/>
-        </w:rPr>
-      </w:pPr>
-    </w:p>
-    <w:p>
-      <w:pPr>
-        <w:spacing w:before="100" w:beforeAutospacing="1" w:after="100" w:afterAutospacing="1" w:line="240" w:lineRule="auto"/>
-        <w:rPr>
-          <w:rFonts w:ascii="Times New Roman" w:eastAsia="Times New Roman" w:hAnsi="Times New Roman" w:cs="Times New Roman"/>
-          <w:kern w:val="0"/>
-          <w:lang/>
+          <w14:ligatures w14:val="none"/>
+        </w:rPr>
+      </w:pPr>
+    </w:p>
+    <w:p>
+      <w:pPr>
+        <w:spacing w:before="100" w:beforeAutospacing="1" w:after="100" w:afterAutospacing="1" w:line="240" w:lineRule="auto"/>
+        <w:rPr>
+          <w:rFonts w:ascii="Times New Roman" w:eastAsia="Times New Roman" w:hAnsi="Times New Roman" w:cs="Times New Roman"/>
+          <w:kern w:val="0"/>
           <w14:ligatures w14:val="none"/>
         </w:rPr>
       </w:pPr>
@@ -2416,7 +2253,6 @@
         <w:rPr>
           <w:rFonts w:ascii="Times New Roman" w:eastAsia="Times New Roman" w:hAnsi="Times New Roman" w:cs="Times New Roman"/>
           <w:kern w:val="0"/>
-          <w:lang/>
           <w14:ligatures w14:val="none"/>
         </w:rPr>
       </w:pPr>
@@ -2425,7 +2261,6 @@
           <w:rFonts w:ascii="Apple Color Emoji" w:eastAsia="Times New Roman" w:hAnsi="Apple Color Emoji" w:cs="Apple Color Emoji"/>
           <w:noProof/>
           <w:kern w:val="0"/>
-          <w:lang/>
           <w14:ligatures w14:val="none"/>
         </w:rPr>
         <w:lastRenderedPageBreak/>
@@ -2470,10 +2305,9 @@
           <w:rFonts w:ascii="Times New Roman" w:eastAsia="Times New Roman" w:hAnsi="Times New Roman" w:cs="Times New Roman"/>
           <w:noProof/>
           <w:kern w:val="0"/>
-          <w:lang/>
         </w:rPr>
         <w:pict w14:anchorId="394F2409">
-          <v:rect id="_x0000_i1035" alt="" style="width:468pt;height:.05pt;mso-width-percent:0;mso-height-percent:0;mso-width-percent:0;mso-height-percent:0" o:hralign="center" o:hrstd="t" o:hr="t" fillcolor="#a0a0a0" stroked="f"/>
+          <v:rect id="_x0000_i1030" alt="" style="width:468pt;height:.05pt;mso-width-percent:0;mso-height-percent:0;mso-width-percent:0;mso-height-percent:0" o:hralign="center" o:hrstd="t" o:hr="t" fillcolor="#a0a0a0" stroked="f"/>
         </w:pict>
       </w:r>
     </w:p>
@@ -2483,15 +2317,13 @@
         <w:rPr>
           <w:rFonts w:ascii="Times New Roman" w:eastAsia="Times New Roman" w:hAnsi="Times New Roman" w:cs="Times New Roman"/>
           <w:kern w:val="0"/>
-          <w:lang/>
-          <w14:ligatures w14:val="none"/>
-        </w:rPr>
-      </w:pPr>
-      <w:r>
-        <w:rPr>
-          <w:rFonts w:ascii="Times New Roman" w:eastAsia="Times New Roman" w:hAnsi="Times New Roman" w:cs="Times New Roman"/>
-          <w:kern w:val="0"/>
-          <w:lang/>
+          <w14:ligatures w14:val="none"/>
+        </w:rPr>
+      </w:pPr>
+      <w:r>
+        <w:rPr>
+          <w:rFonts w:ascii="Times New Roman" w:eastAsia="Times New Roman" w:hAnsi="Times New Roman" w:cs="Times New Roman"/>
+          <w:kern w:val="0"/>
           <w14:ligatures w14:val="none"/>
         </w:rPr>
         <w:t>CloudWatch logs confirmed that no injected code was executed and no custom error message appeared.</w:t>
@@ -2503,7 +2335,6 @@
         <w:rPr>
           <w:rFonts w:ascii="Times New Roman" w:eastAsia="Times New Roman" w:hAnsi="Times New Roman" w:cs="Times New Roman"/>
           <w:kern w:val="0"/>
-          <w:lang/>
           <w14:ligatures w14:val="none"/>
         </w:rPr>
       </w:pPr>
@@ -2514,7 +2345,6 @@
         <w:rPr>
           <w:rFonts w:ascii="Times New Roman" w:eastAsia="Times New Roman" w:hAnsi="Times New Roman" w:cs="Times New Roman"/>
           <w:kern w:val="0"/>
-          <w:lang/>
           <w14:ligatures w14:val="none"/>
         </w:rPr>
       </w:pPr>
@@ -2523,7 +2353,6 @@
           <w:rFonts w:ascii="Apple Color Emoji" w:eastAsia="Times New Roman" w:hAnsi="Apple Color Emoji" w:cs="Apple Color Emoji"/>
           <w:noProof/>
           <w:kern w:val="0"/>
-          <w:lang/>
           <w14:ligatures w14:val="none"/>
         </w:rPr>
         <w:drawing>
@@ -2567,10 +2396,9 @@
           <w:rFonts w:ascii="Times New Roman" w:eastAsia="Times New Roman" w:hAnsi="Times New Roman" w:cs="Times New Roman"/>
           <w:noProof/>
           <w:kern w:val="0"/>
-          <w:lang/>
         </w:rPr>
         <w:pict w14:anchorId="2C263A86">
-          <v:rect id="_x0000_i1036" alt="" style="width:468pt;height:.05pt;mso-width-percent:0;mso-height-percent:0;mso-width-percent:0;mso-height-percent:0" o:hralign="center" o:hrstd="t" o:hr="t" fillcolor="#a0a0a0" stroked="f"/>
+          <v:rect id="_x0000_i1029" alt="" style="width:468pt;height:.05pt;mso-width-percent:0;mso-height-percent:0;mso-width-percent:0;mso-height-percent:0" o:hralign="center" o:hrstd="t" o:hr="t" fillcolor="#a0a0a0" stroked="f"/>
         </w:pict>
       </w:r>
     </w:p>
@@ -2580,7 +2408,6 @@
         <w:rPr>
           <w:rFonts w:ascii="Times New Roman" w:eastAsia="Times New Roman" w:hAnsi="Times New Roman" w:cs="Times New Roman"/>
           <w:kern w:val="0"/>
-          <w:lang/>
           <w14:ligatures w14:val="none"/>
         </w:rPr>
       </w:pPr>
@@ -2589,7 +2416,6 @@
           <w:rFonts w:ascii="Apple Color Emoji" w:eastAsia="Times New Roman" w:hAnsi="Apple Color Emoji" w:cs="Apple Color Emoji"/>
           <w:noProof/>
           <w:kern w:val="0"/>
-          <w:lang/>
           <w14:ligatures w14:val="none"/>
         </w:rPr>
         <w:lastRenderedPageBreak/>
@@ -2653,7 +2479,6 @@
         <w:rPr>
           <w:rFonts w:ascii="Times New Roman" w:eastAsia="Times New Roman" w:hAnsi="Times New Roman" w:cs="Times New Roman"/>
           <w:kern w:val="0"/>
-          <w:lang/>
           <w14:ligatures w14:val="none"/>
         </w:rPr>
         <w:t>Additionally, normal requests using valid input continued to work correctly.</w:t>
@@ -2665,7 +2490,6 @@
         <w:rPr>
           <w:rFonts w:ascii="Times New Roman" w:eastAsia="Times New Roman" w:hAnsi="Times New Roman" w:cs="Times New Roman"/>
           <w:kern w:val="0"/>
-          <w:lang/>
           <w14:ligatures w14:val="none"/>
         </w:rPr>
       </w:pPr>
@@ -2676,7 +2500,6 @@
         <w:rPr>
           <w:rFonts w:ascii="Times New Roman" w:eastAsia="Times New Roman" w:hAnsi="Times New Roman" w:cs="Times New Roman"/>
           <w:kern w:val="0"/>
-          <w:lang/>
           <w14:ligatures w14:val="none"/>
         </w:rPr>
       </w:pPr>
@@ -2685,10 +2508,9 @@
           <w:rFonts w:ascii="Times New Roman" w:eastAsia="Times New Roman" w:hAnsi="Times New Roman" w:cs="Times New Roman"/>
           <w:noProof/>
           <w:kern w:val="0"/>
-          <w:lang/>
         </w:rPr>
         <w:pict w14:anchorId="519FF009">
-          <v:rect id="_x0000_i1037" alt="" style="width:468pt;height:.05pt;mso-width-percent:0;mso-height-percent:0;mso-width-percent:0;mso-height-percent:0" o:hralign="center" o:hrstd="t" o:hr="t" fillcolor="#a0a0a0" stroked="f"/>
+          <v:rect id="_x0000_i1028" alt="" style="width:468pt;height:.05pt;mso-width-percent:0;mso-height-percent:0;mso-width-percent:0;mso-height-percent:0" o:hralign="center" o:hrstd="t" o:hr="t" fillcolor="#a0a0a0" stroked="f"/>
         </w:pict>
       </w:r>
     </w:p>
@@ -2706,7 +2528,6 @@
           <w:kern w:val="0"/>
           <w:sz w:val="36"/>
           <w:szCs w:val="36"/>
-          <w:lang/>
           <w14:ligatures w14:val="none"/>
         </w:rPr>
       </w:pPr>
@@ -2725,7 +2546,6 @@
           <w:kern w:val="0"/>
           <w:sz w:val="36"/>
           <w:szCs w:val="36"/>
-          <w:lang/>
           <w14:ligatures w14:val="none"/>
         </w:rPr>
       </w:pPr>
@@ -2739,7 +2559,6 @@
           <w:kern w:val="0"/>
           <w:sz w:val="36"/>
           <w:szCs w:val="36"/>
-          <w:lang/>
           <w14:ligatures w14:val="none"/>
         </w:rPr>
         <w:t>Structured Operation and Security Analysis</w:t>
@@ -2751,7 +2570,6 @@
         <w:rPr>
           <w:rFonts w:ascii="Times New Roman" w:eastAsia="Times New Roman" w:hAnsi="Times New Roman" w:cs="Times New Roman"/>
           <w:kern w:val="0"/>
-          <w:lang/>
           <w14:ligatures w14:val="none"/>
         </w:rPr>
       </w:pPr>
@@ -2767,7 +2585,6 @@
           <w:kern w:val="0"/>
           <w:sz w:val="27"/>
           <w:szCs w:val="27"/>
-          <w:lang/>
           <w14:ligatures w14:val="none"/>
         </w:rPr>
       </w:pPr>
@@ -2779,7 +2596,6 @@
           <w:kern w:val="0"/>
           <w:sz w:val="27"/>
           <w:szCs w:val="27"/>
-          <w:lang/>
           <w14:ligatures w14:val="none"/>
         </w:rPr>
         <w:t>1) Intended Logic and Security Rule(s)</w:t>
@@ -2791,15 +2607,13 @@
         <w:rPr>
           <w:rFonts w:ascii="Times New Roman" w:eastAsia="Times New Roman" w:hAnsi="Times New Roman" w:cs="Times New Roman"/>
           <w:kern w:val="0"/>
-          <w:lang/>
-          <w14:ligatures w14:val="none"/>
-        </w:rPr>
-      </w:pPr>
-      <w:r>
-        <w:rPr>
-          <w:rFonts w:ascii="Times New Roman" w:eastAsia="Times New Roman" w:hAnsi="Times New Roman" w:cs="Times New Roman"/>
-          <w:kern w:val="0"/>
-          <w:lang/>
+          <w14:ligatures w14:val="none"/>
+        </w:rPr>
+      </w:pPr>
+      <w:r>
+        <w:rPr>
+          <w:rFonts w:ascii="Times New Roman" w:eastAsia="Times New Roman" w:hAnsi="Times New Roman" w:cs="Times New Roman"/>
+          <w:kern w:val="0"/>
           <w14:ligatures w14:val="none"/>
         </w:rPr>
         <w:t>Under normal conditions, a user sends a request through API Gateway, which forwards the request to the Lambda function. The Lambda function should parse the request body as plain JSON, validate input fields, and process the requested action.</w:t>
@@ -2811,26 +2625,23 @@
         <w:rPr>
           <w:rFonts w:ascii="Times New Roman" w:eastAsia="Times New Roman" w:hAnsi="Times New Roman" w:cs="Times New Roman"/>
           <w:kern w:val="0"/>
-          <w:lang/>
-          <w14:ligatures w14:val="none"/>
-        </w:rPr>
-      </w:pPr>
-    </w:p>
-    <w:p>
-      <w:pPr>
-        <w:spacing w:before="100" w:beforeAutospacing="1" w:after="100" w:afterAutospacing="1" w:line="240" w:lineRule="auto"/>
-        <w:rPr>
-          <w:rFonts w:ascii="Times New Roman" w:eastAsia="Times New Roman" w:hAnsi="Times New Roman" w:cs="Times New Roman"/>
-          <w:kern w:val="0"/>
-          <w:lang/>
-          <w14:ligatures w14:val="none"/>
-        </w:rPr>
-      </w:pPr>
-      <w:r>
-        <w:rPr>
-          <w:rFonts w:ascii="Times New Roman" w:eastAsia="Times New Roman" w:hAnsi="Times New Roman" w:cs="Times New Roman"/>
-          <w:kern w:val="0"/>
-          <w:lang/>
+          <w14:ligatures w14:val="none"/>
+        </w:rPr>
+      </w:pPr>
+    </w:p>
+    <w:p>
+      <w:pPr>
+        <w:spacing w:before="100" w:beforeAutospacing="1" w:after="100" w:afterAutospacing="1" w:line="240" w:lineRule="auto"/>
+        <w:rPr>
+          <w:rFonts w:ascii="Times New Roman" w:eastAsia="Times New Roman" w:hAnsi="Times New Roman" w:cs="Times New Roman"/>
+          <w:kern w:val="0"/>
+          <w14:ligatures w14:val="none"/>
+        </w:rPr>
+      </w:pPr>
+      <w:r>
+        <w:rPr>
+          <w:rFonts w:ascii="Times New Roman" w:eastAsia="Times New Roman" w:hAnsi="Times New Roman" w:cs="Times New Roman"/>
+          <w:kern w:val="0"/>
           <w14:ligatures w14:val="none"/>
         </w:rPr>
         <w:t>The main security rules are:</w:t>
@@ -2846,15 +2657,13 @@
         <w:rPr>
           <w:rFonts w:ascii="Times New Roman" w:eastAsia="Times New Roman" w:hAnsi="Times New Roman" w:cs="Times New Roman"/>
           <w:kern w:val="0"/>
-          <w:lang/>
-          <w14:ligatures w14:val="none"/>
-        </w:rPr>
-      </w:pPr>
-      <w:r>
-        <w:rPr>
-          <w:rFonts w:ascii="Times New Roman" w:eastAsia="Times New Roman" w:hAnsi="Times New Roman" w:cs="Times New Roman"/>
-          <w:kern w:val="0"/>
-          <w:lang/>
+          <w14:ligatures w14:val="none"/>
+        </w:rPr>
+      </w:pPr>
+      <w:r>
+        <w:rPr>
+          <w:rFonts w:ascii="Times New Roman" w:eastAsia="Times New Roman" w:hAnsi="Times New Roman" w:cs="Times New Roman"/>
+          <w:kern w:val="0"/>
           <w14:ligatures w14:val="none"/>
         </w:rPr>
         <w:t>The system must treat user input strictly as data, not executable code</w:t>
@@ -2870,15 +2679,13 @@
         <w:rPr>
           <w:rFonts w:ascii="Times New Roman" w:eastAsia="Times New Roman" w:hAnsi="Times New Roman" w:cs="Times New Roman"/>
           <w:kern w:val="0"/>
-          <w:lang/>
-          <w14:ligatures w14:val="none"/>
-        </w:rPr>
-      </w:pPr>
-      <w:r>
-        <w:rPr>
-          <w:rFonts w:ascii="Times New Roman" w:eastAsia="Times New Roman" w:hAnsi="Times New Roman" w:cs="Times New Roman"/>
-          <w:kern w:val="0"/>
-          <w:lang/>
+          <w14:ligatures w14:val="none"/>
+        </w:rPr>
+      </w:pPr>
+      <w:r>
+        <w:rPr>
+          <w:rFonts w:ascii="Times New Roman" w:eastAsia="Times New Roman" w:hAnsi="Times New Roman" w:cs="Times New Roman"/>
+          <w:kern w:val="0"/>
           <w14:ligatures w14:val="none"/>
         </w:rPr>
         <w:t>The system must not execute any content derived from user input</w:t>
@@ -2894,15 +2701,13 @@
         <w:rPr>
           <w:rFonts w:ascii="Times New Roman" w:eastAsia="Times New Roman" w:hAnsi="Times New Roman" w:cs="Times New Roman"/>
           <w:kern w:val="0"/>
-          <w:lang/>
-          <w14:ligatures w14:val="none"/>
-        </w:rPr>
-      </w:pPr>
-      <w:r>
-        <w:rPr>
-          <w:rFonts w:ascii="Times New Roman" w:eastAsia="Times New Roman" w:hAnsi="Times New Roman" w:cs="Times New Roman"/>
-          <w:kern w:val="0"/>
-          <w:lang/>
+          <w14:ligatures w14:val="none"/>
+        </w:rPr>
+      </w:pPr>
+      <w:r>
+        <w:rPr>
+          <w:rFonts w:ascii="Times New Roman" w:eastAsia="Times New Roman" w:hAnsi="Times New Roman" w:cs="Times New Roman"/>
+          <w:kern w:val="0"/>
           <w14:ligatures w14:val="none"/>
         </w:rPr>
         <w:t>The system must validate all request fields before processing</w:t>
@@ -2914,7 +2719,6 @@
         <w:rPr>
           <w:rFonts w:ascii="Times New Roman" w:eastAsia="Times New Roman" w:hAnsi="Times New Roman" w:cs="Times New Roman"/>
           <w:kern w:val="0"/>
-          <w:lang/>
           <w14:ligatures w14:val="none"/>
         </w:rPr>
       </w:pPr>
@@ -2923,10 +2727,9 @@
           <w:rFonts w:ascii="Times New Roman" w:eastAsia="Times New Roman" w:hAnsi="Times New Roman" w:cs="Times New Roman"/>
           <w:noProof/>
           <w:kern w:val="0"/>
-          <w:lang/>
         </w:rPr>
         <w:pict w14:anchorId="7FC85C70">
-          <v:rect id="_x0000_i1038" alt="" style="width:468pt;height:.05pt;mso-width-percent:0;mso-height-percent:0;mso-width-percent:0;mso-height-percent:0" o:hralign="center" o:hrstd="t" o:hr="t" fillcolor="#a0a0a0" stroked="f"/>
+          <v:rect id="_x0000_i1027" alt="" style="width:468pt;height:.05pt;mso-width-percent:0;mso-height-percent:0;mso-width-percent:0;mso-height-percent:0" o:hralign="center" o:hrstd="t" o:hr="t" fillcolor="#a0a0a0" stroked="f"/>
         </w:pict>
       </w:r>
     </w:p>
@@ -2941,7 +2744,6 @@
           <w:kern w:val="0"/>
           <w:sz w:val="27"/>
           <w:szCs w:val="27"/>
-          <w:lang/>
           <w14:ligatures w14:val="none"/>
         </w:rPr>
       </w:pPr>
@@ -2957,7 +2759,6 @@
           <w:kern w:val="0"/>
           <w:sz w:val="27"/>
           <w:szCs w:val="27"/>
-          <w:lang/>
           <w14:ligatures w14:val="none"/>
         </w:rPr>
       </w:pPr>
@@ -2969,7 +2770,6 @@
           <w:kern w:val="0"/>
           <w:sz w:val="27"/>
           <w:szCs w:val="27"/>
-          <w:lang/>
           <w14:ligatures w14:val="none"/>
         </w:rPr>
         <w:lastRenderedPageBreak/>
@@ -2982,15 +2782,13 @@
         <w:rPr>
           <w:rFonts w:ascii="Times New Roman" w:eastAsia="Times New Roman" w:hAnsi="Times New Roman" w:cs="Times New Roman"/>
           <w:kern w:val="0"/>
-          <w:lang/>
-          <w14:ligatures w14:val="none"/>
-        </w:rPr>
-      </w:pPr>
-      <w:r>
-        <w:rPr>
-          <w:rFonts w:ascii="Times New Roman" w:eastAsia="Times New Roman" w:hAnsi="Times New Roman" w:cs="Times New Roman"/>
-          <w:kern w:val="0"/>
-          <w:lang/>
+          <w14:ligatures w14:val="none"/>
+        </w:rPr>
+      </w:pPr>
+      <w:r>
+        <w:rPr>
+          <w:rFonts w:ascii="Times New Roman" w:eastAsia="Times New Roman" w:hAnsi="Times New Roman" w:cs="Times New Roman"/>
+          <w:kern w:val="0"/>
           <w14:ligatures w14:val="none"/>
         </w:rPr>
         <w:t>The analysis was based on:</w:t>
@@ -3006,15 +2804,13 @@
         <w:rPr>
           <w:rFonts w:ascii="Times New Roman" w:eastAsia="Times New Roman" w:hAnsi="Times New Roman" w:cs="Times New Roman"/>
           <w:kern w:val="0"/>
-          <w:lang/>
-          <w14:ligatures w14:val="none"/>
-        </w:rPr>
-      </w:pPr>
-      <w:r>
-        <w:rPr>
-          <w:rFonts w:ascii="Times New Roman" w:eastAsia="Times New Roman" w:hAnsi="Times New Roman" w:cs="Times New Roman"/>
-          <w:kern w:val="0"/>
-          <w:lang/>
+          <w14:ligatures w14:val="none"/>
+        </w:rPr>
+      </w:pPr>
+      <w:r>
+        <w:rPr>
+          <w:rFonts w:ascii="Times New Roman" w:eastAsia="Times New Roman" w:hAnsi="Times New Roman" w:cs="Times New Roman"/>
+          <w:kern w:val="0"/>
           <w14:ligatures w14:val="none"/>
         </w:rPr>
         <w:t>API requests and responses (Postman)</w:t>
@@ -3030,15 +2826,13 @@
         <w:rPr>
           <w:rFonts w:ascii="Times New Roman" w:eastAsia="Times New Roman" w:hAnsi="Times New Roman" w:cs="Times New Roman"/>
           <w:kern w:val="0"/>
-          <w:lang/>
-          <w14:ligatures w14:val="none"/>
-        </w:rPr>
-      </w:pPr>
-      <w:r>
-        <w:rPr>
-          <w:rFonts w:ascii="Times New Roman" w:eastAsia="Times New Roman" w:hAnsi="Times New Roman" w:cs="Times New Roman"/>
-          <w:kern w:val="0"/>
-          <w:lang/>
+          <w14:ligatures w14:val="none"/>
+        </w:rPr>
+      </w:pPr>
+      <w:r>
+        <w:rPr>
+          <w:rFonts w:ascii="Times New Roman" w:eastAsia="Times New Roman" w:hAnsi="Times New Roman" w:cs="Times New Roman"/>
+          <w:kern w:val="0"/>
           <w14:ligatures w14:val="none"/>
         </w:rPr>
         <w:t>Browser DevTools</w:t>
@@ -3054,15 +2848,13 @@
         <w:rPr>
           <w:rFonts w:ascii="Times New Roman" w:eastAsia="Times New Roman" w:hAnsi="Times New Roman" w:cs="Times New Roman"/>
           <w:kern w:val="0"/>
-          <w:lang/>
-          <w14:ligatures w14:val="none"/>
-        </w:rPr>
-      </w:pPr>
-      <w:r>
-        <w:rPr>
-          <w:rFonts w:ascii="Times New Roman" w:eastAsia="Times New Roman" w:hAnsi="Times New Roman" w:cs="Times New Roman"/>
-          <w:kern w:val="0"/>
-          <w:lang/>
+          <w14:ligatures w14:val="none"/>
+        </w:rPr>
+      </w:pPr>
+      <w:r>
+        <w:rPr>
+          <w:rFonts w:ascii="Times New Roman" w:eastAsia="Times New Roman" w:hAnsi="Times New Roman" w:cs="Times New Roman"/>
+          <w:kern w:val="0"/>
           <w14:ligatures w14:val="none"/>
         </w:rPr>
         <w:t>AWS CloudWatch Logs</w:t>
@@ -3074,7 +2866,6 @@
         <w:rPr>
           <w:rFonts w:ascii="Times New Roman" w:eastAsia="Times New Roman" w:hAnsi="Times New Roman" w:cs="Times New Roman"/>
           <w:kern w:val="0"/>
-          <w:lang/>
           <w14:ligatures w14:val="none"/>
         </w:rPr>
       </w:pPr>
@@ -3090,7 +2881,6 @@
           <w:iCs/>
           <w:kern w:val="0"/>
           <w:u w:val="single"/>
-          <w:lang/>
           <w14:ligatures w14:val="none"/>
         </w:rPr>
       </w:pPr>
@@ -3103,7 +2893,6 @@
           <w:iCs/>
           <w:kern w:val="0"/>
           <w:u w:val="single"/>
-          <w:lang/>
           <w14:ligatures w14:val="none"/>
         </w:rPr>
         <w:t>Behavior comparison</w:t>
@@ -3117,7 +2906,6 @@
           <w:iCs/>
           <w:kern w:val="0"/>
           <w:u w:val="single"/>
-          <w:lang/>
           <w14:ligatures w14:val="none"/>
         </w:rPr>
         <w:t>:</w:t>
@@ -3131,7 +2919,6 @@
           <w:b/>
           <w:bCs/>
           <w:kern w:val="0"/>
-          <w:lang/>
           <w14:ligatures w14:val="none"/>
         </w:rPr>
       </w:pPr>
@@ -3141,7 +2928,6 @@
           <w:b/>
           <w:bCs/>
           <w:kern w:val="0"/>
-          <w:lang/>
           <w14:ligatures w14:val="none"/>
         </w:rPr>
         <w:t>Normal Behavior:</w:t>
@@ -3153,15 +2939,13 @@
         <w:rPr>
           <w:rFonts w:ascii="Times New Roman" w:eastAsia="Times New Roman" w:hAnsi="Times New Roman" w:cs="Times New Roman"/>
           <w:kern w:val="0"/>
-          <w:lang/>
-          <w14:ligatures w14:val="none"/>
-        </w:rPr>
-      </w:pPr>
-      <w:r>
-        <w:rPr>
-          <w:rFonts w:ascii="Times New Roman" w:eastAsia="Times New Roman" w:hAnsi="Times New Roman" w:cs="Times New Roman"/>
-          <w:kern w:val="0"/>
-          <w:lang/>
+          <w14:ligatures w14:val="none"/>
+        </w:rPr>
+      </w:pPr>
+      <w:r>
+        <w:rPr>
+          <w:rFonts w:ascii="Times New Roman" w:eastAsia="Times New Roman" w:hAnsi="Times New Roman" w:cs="Times New Roman"/>
+          <w:kern w:val="0"/>
           <w14:ligatures w14:val="none"/>
         </w:rPr>
         <w:t>Valid request returns expected results.</w:t>
@@ -3173,7 +2957,6 @@
         <w:rPr>
           <w:rFonts w:ascii="Times New Roman" w:eastAsia="Times New Roman" w:hAnsi="Times New Roman" w:cs="Times New Roman"/>
           <w:kern w:val="0"/>
-          <w:lang/>
           <w14:ligatures w14:val="none"/>
         </w:rPr>
       </w:pPr>
@@ -3186,7 +2969,6 @@
           <w:b/>
           <w:bCs/>
           <w:kern w:val="0"/>
-          <w:lang/>
           <w14:ligatures w14:val="none"/>
         </w:rPr>
       </w:pPr>
@@ -3196,7 +2978,6 @@
           <w:b/>
           <w:bCs/>
           <w:kern w:val="0"/>
-          <w:lang/>
           <w14:ligatures w14:val="none"/>
         </w:rPr>
         <w:t>Exploit Behavior:</w:t>
@@ -3208,15 +2989,13 @@
         <w:rPr>
           <w:rFonts w:ascii="Times New Roman" w:eastAsia="Times New Roman" w:hAnsi="Times New Roman" w:cs="Times New Roman"/>
           <w:kern w:val="0"/>
-          <w:lang/>
-          <w14:ligatures w14:val="none"/>
-        </w:rPr>
-      </w:pPr>
-      <w:r>
-        <w:rPr>
-          <w:rFonts w:ascii="Times New Roman" w:eastAsia="Times New Roman" w:hAnsi="Times New Roman" w:cs="Times New Roman"/>
-          <w:kern w:val="0"/>
-          <w:lang/>
+          <w14:ligatures w14:val="none"/>
+        </w:rPr>
+      </w:pPr>
+      <w:r>
+        <w:rPr>
+          <w:rFonts w:ascii="Times New Roman" w:eastAsia="Times New Roman" w:hAnsi="Times New Roman" w:cs="Times New Roman"/>
+          <w:kern w:val="0"/>
           <w14:ligatures w14:val="none"/>
         </w:rPr>
         <w:t>Crafted payload executes during deserialization and produces custom error (INJECTEDbyMK).</w:t>
@@ -3228,7 +3007,6 @@
         <w:rPr>
           <w:rFonts w:ascii="Times New Roman" w:eastAsia="Times New Roman" w:hAnsi="Times New Roman" w:cs="Times New Roman"/>
           <w:kern w:val="0"/>
-          <w:lang/>
           <w14:ligatures w14:val="none"/>
         </w:rPr>
       </w:pPr>
@@ -3241,7 +3019,6 @@
           <w:b/>
           <w:bCs/>
           <w:kern w:val="0"/>
-          <w:lang/>
           <w14:ligatures w14:val="none"/>
         </w:rPr>
       </w:pPr>
@@ -3251,7 +3028,6 @@
           <w:b/>
           <w:bCs/>
           <w:kern w:val="0"/>
-          <w:lang/>
           <w14:ligatures w14:val="none"/>
         </w:rPr>
         <w:t>Post-Fix Behavior:</w:t>
@@ -3263,15 +3039,13 @@
         <w:rPr>
           <w:rFonts w:ascii="Times New Roman" w:eastAsia="Times New Roman" w:hAnsi="Times New Roman" w:cs="Times New Roman"/>
           <w:kern w:val="0"/>
-          <w:lang/>
-          <w14:ligatures w14:val="none"/>
-        </w:rPr>
-      </w:pPr>
-      <w:r>
-        <w:rPr>
-          <w:rFonts w:ascii="Times New Roman" w:eastAsia="Times New Roman" w:hAnsi="Times New Roman" w:cs="Times New Roman"/>
-          <w:kern w:val="0"/>
-          <w:lang/>
+          <w14:ligatures w14:val="none"/>
+        </w:rPr>
+      </w:pPr>
+      <w:r>
+        <w:rPr>
+          <w:rFonts w:ascii="Times New Roman" w:eastAsia="Times New Roman" w:hAnsi="Times New Roman" w:cs="Times New Roman"/>
+          <w:kern w:val="0"/>
           <w14:ligatures w14:val="none"/>
         </w:rPr>
         <w:t>Injected payload is no longer executed and the system behaves safely.</w:t>
@@ -3283,7 +3057,6 @@
         <w:rPr>
           <w:rFonts w:ascii="Times New Roman" w:eastAsia="Times New Roman" w:hAnsi="Times New Roman" w:cs="Times New Roman"/>
           <w:kern w:val="0"/>
-          <w:lang/>
           <w14:ligatures w14:val="none"/>
         </w:rPr>
       </w:pPr>
@@ -3292,10 +3065,9 @@
           <w:rFonts w:ascii="Times New Roman" w:eastAsia="Times New Roman" w:hAnsi="Times New Roman" w:cs="Times New Roman"/>
           <w:noProof/>
           <w:kern w:val="0"/>
-          <w:lang/>
         </w:rPr>
         <w:pict w14:anchorId="448F265B">
-          <v:rect id="_x0000_i1039" alt="" style="width:468pt;height:.05pt;mso-width-percent:0;mso-height-percent:0;mso-width-percent:0;mso-height-percent:0" o:hralign="center" o:hrstd="t" o:hr="t" fillcolor="#a0a0a0" stroked="f"/>
+          <v:rect id="_x0000_i1026" alt="" style="width:468pt;height:.05pt;mso-width-percent:0;mso-height-percent:0;mso-width-percent:0;mso-height-percent:0" o:hralign="center" o:hrstd="t" o:hr="t" fillcolor="#a0a0a0" stroked="f"/>
         </w:pict>
       </w:r>
     </w:p>
@@ -3310,7 +3082,6 @@
           <w:kern w:val="0"/>
           <w:sz w:val="27"/>
           <w:szCs w:val="27"/>
-          <w:lang/>
           <w14:ligatures w14:val="none"/>
         </w:rPr>
       </w:pPr>
@@ -3322,7 +3093,6 @@
           <w:kern w:val="0"/>
           <w:sz w:val="27"/>
           <w:szCs w:val="27"/>
-          <w:lang/>
           <w14:ligatures w14:val="none"/>
         </w:rPr>
         <w:t>3) Deviation Analysis and Classification</w:t>
@@ -3334,26 +3104,23 @@
         <w:rPr>
           <w:rFonts w:ascii="Times New Roman" w:eastAsia="Times New Roman" w:hAnsi="Times New Roman" w:cs="Times New Roman"/>
           <w:kern w:val="0"/>
-          <w:lang/>
-          <w14:ligatures w14:val="none"/>
-        </w:rPr>
-      </w:pPr>
-    </w:p>
-    <w:p>
-      <w:pPr>
-        <w:spacing w:before="100" w:beforeAutospacing="1" w:after="100" w:afterAutospacing="1" w:line="240" w:lineRule="auto"/>
-        <w:rPr>
-          <w:rFonts w:ascii="Times New Roman" w:eastAsia="Times New Roman" w:hAnsi="Times New Roman" w:cs="Times New Roman"/>
-          <w:kern w:val="0"/>
-          <w:lang/>
-          <w14:ligatures w14:val="none"/>
-        </w:rPr>
-      </w:pPr>
-      <w:r>
-        <w:rPr>
-          <w:rFonts w:ascii="Times New Roman" w:eastAsia="Times New Roman" w:hAnsi="Times New Roman" w:cs="Times New Roman"/>
-          <w:kern w:val="0"/>
-          <w:lang/>
+          <w14:ligatures w14:val="none"/>
+        </w:rPr>
+      </w:pPr>
+    </w:p>
+    <w:p>
+      <w:pPr>
+        <w:spacing w:before="100" w:beforeAutospacing="1" w:after="100" w:afterAutospacing="1" w:line="240" w:lineRule="auto"/>
+        <w:rPr>
+          <w:rFonts w:ascii="Times New Roman" w:eastAsia="Times New Roman" w:hAnsi="Times New Roman" w:cs="Times New Roman"/>
+          <w:kern w:val="0"/>
+          <w14:ligatures w14:val="none"/>
+        </w:rPr>
+      </w:pPr>
+      <w:r>
+        <w:rPr>
+          <w:rFonts w:ascii="Times New Roman" w:eastAsia="Times New Roman" w:hAnsi="Times New Roman" w:cs="Times New Roman"/>
+          <w:kern w:val="0"/>
           <w14:ligatures w14:val="none"/>
         </w:rPr>
         <w:t>The exploit behavior represents a clear deviation from intended system behavior. Instead of treating request input as plain data, the system executes attacker-controlled code during deserialization.This violates the rule that user input must never influence code execution.</w:t>
@@ -3365,15 +3132,13 @@
         <w:rPr>
           <w:rFonts w:ascii="Times New Roman" w:eastAsia="Times New Roman" w:hAnsi="Times New Roman" w:cs="Times New Roman"/>
           <w:kern w:val="0"/>
-          <w:lang/>
-          <w14:ligatures w14:val="none"/>
-        </w:rPr>
-      </w:pPr>
-      <w:r>
-        <w:rPr>
-          <w:rFonts w:ascii="Times New Roman" w:eastAsia="Times New Roman" w:hAnsi="Times New Roman" w:cs="Times New Roman"/>
-          <w:kern w:val="0"/>
-          <w:lang/>
+          <w14:ligatures w14:val="none"/>
+        </w:rPr>
+      </w:pPr>
+      <w:r>
+        <w:rPr>
+          <w:rFonts w:ascii="Times New Roman" w:eastAsia="Times New Roman" w:hAnsi="Times New Roman" w:cs="Times New Roman"/>
+          <w:kern w:val="0"/>
           <w14:ligatures w14:val="none"/>
         </w:rPr>
         <w:t>This case is classified as:Intentional misuse / security-relevant abuse</w:t>
@@ -3385,7 +3150,6 @@
         <w:rPr>
           <w:rFonts w:ascii="Times New Roman" w:eastAsia="Times New Roman" w:hAnsi="Times New Roman" w:cs="Times New Roman"/>
           <w:kern w:val="0"/>
-          <w:lang/>
           <w14:ligatures w14:val="none"/>
         </w:rPr>
       </w:pPr>
@@ -3394,10 +3158,9 @@
           <w:rFonts w:ascii="Times New Roman" w:eastAsia="Times New Roman" w:hAnsi="Times New Roman" w:cs="Times New Roman"/>
           <w:noProof/>
           <w:kern w:val="0"/>
-          <w:lang/>
         </w:rPr>
         <w:pict w14:anchorId="42BF39AA">
-          <v:rect id="_x0000_i1040" alt="" style="width:468pt;height:.05pt;mso-width-percent:0;mso-height-percent:0;mso-width-percent:0;mso-height-percent:0" o:hralign="center" o:hrstd="t" o:hr="t" fillcolor="#a0a0a0" stroked="f"/>
+          <v:rect id="_x0000_i1025" alt="" style="width:468pt;height:.05pt;mso-width-percent:0;mso-height-percent:0;mso-width-percent:0;mso-height-percent:0" o:hralign="center" o:hrstd="t" o:hr="t" fillcolor="#a0a0a0" stroked="f"/>
         </w:pict>
       </w:r>
     </w:p>
@@ -3412,7 +3175,6 @@
           <w:kern w:val="0"/>
           <w:sz w:val="27"/>
           <w:szCs w:val="27"/>
-          <w:lang/>
           <w14:ligatures w14:val="none"/>
         </w:rPr>
       </w:pPr>
@@ -3424,7 +3186,6 @@
           <w:kern w:val="0"/>
           <w:sz w:val="27"/>
           <w:szCs w:val="27"/>
-          <w:lang/>
           <w14:ligatures w14:val="none"/>
         </w:rPr>
         <w:t>4) Explainable Fix and Post-Fix Validation</w:t>
@@ -3441,26 +3202,23 @@
           <w:kern w:val="0"/>
           <w:sz w:val="27"/>
           <w:szCs w:val="27"/>
-          <w:lang/>
-          <w14:ligatures w14:val="none"/>
-        </w:rPr>
-      </w:pPr>
-    </w:p>
-    <w:p>
-      <w:pPr>
-        <w:spacing w:before="100" w:beforeAutospacing="1" w:after="100" w:afterAutospacing="1" w:line="240" w:lineRule="auto"/>
-        <w:rPr>
-          <w:rFonts w:ascii="Times New Roman" w:eastAsia="Times New Roman" w:hAnsi="Times New Roman" w:cs="Times New Roman"/>
-          <w:kern w:val="0"/>
-          <w:lang/>
-          <w14:ligatures w14:val="none"/>
-        </w:rPr>
-      </w:pPr>
-      <w:r>
-        <w:rPr>
-          <w:rFonts w:ascii="Times New Roman" w:eastAsia="Times New Roman" w:hAnsi="Times New Roman" w:cs="Times New Roman"/>
-          <w:kern w:val="0"/>
-          <w:lang/>
+          <w14:ligatures w14:val="none"/>
+        </w:rPr>
+      </w:pPr>
+    </w:p>
+    <w:p>
+      <w:pPr>
+        <w:spacing w:before="100" w:beforeAutospacing="1" w:after="100" w:afterAutospacing="1" w:line="240" w:lineRule="auto"/>
+        <w:rPr>
+          <w:rFonts w:ascii="Times New Roman" w:eastAsia="Times New Roman" w:hAnsi="Times New Roman" w:cs="Times New Roman"/>
+          <w:kern w:val="0"/>
+          <w14:ligatures w14:val="none"/>
+        </w:rPr>
+      </w:pPr>
+      <w:r>
+        <w:rPr>
+          <w:rFonts w:ascii="Times New Roman" w:eastAsia="Times New Roman" w:hAnsi="Times New Roman" w:cs="Times New Roman"/>
+          <w:kern w:val="0"/>
           <w14:ligatures w14:val="none"/>
         </w:rPr>
         <w:lastRenderedPageBreak/>
@@ -3470,7 +3228,6 @@
         <w:rPr>
           <w:rFonts w:ascii="Times New Roman" w:eastAsia="Times New Roman" w:hAnsi="Times New Roman" w:cs="Times New Roman"/>
           <w:kern w:val="0"/>
-          <w:lang/>
           <w14:ligatures w14:val="none"/>
         </w:rPr>
         <w:t xml:space="preserve"> </w:t>
@@ -3479,7 +3236,6 @@
         <w:rPr>
           <w:rFonts w:ascii="Times New Roman" w:eastAsia="Times New Roman" w:hAnsi="Times New Roman" w:cs="Times New Roman"/>
           <w:kern w:val="0"/>
-          <w:lang/>
           <w14:ligatures w14:val="none"/>
         </w:rPr>
         <w:t>The fix removes unsafe deserialization and enforces strict JSON parsing.</w:t>
@@ -3491,15 +3247,13 @@
         <w:rPr>
           <w:rFonts w:ascii="Times New Roman" w:eastAsia="Times New Roman" w:hAnsi="Times New Roman" w:cs="Times New Roman"/>
           <w:kern w:val="0"/>
-          <w:lang/>
-          <w14:ligatures w14:val="none"/>
-        </w:rPr>
-      </w:pPr>
-      <w:r>
-        <w:rPr>
-          <w:rFonts w:ascii="Times New Roman" w:eastAsia="Times New Roman" w:hAnsi="Times New Roman" w:cs="Times New Roman"/>
-          <w:kern w:val="0"/>
-          <w:lang/>
+          <w14:ligatures w14:val="none"/>
+        </w:rPr>
+      </w:pPr>
+      <w:r>
+        <w:rPr>
+          <w:rFonts w:ascii="Times New Roman" w:eastAsia="Times New Roman" w:hAnsi="Times New Roman" w:cs="Times New Roman"/>
+          <w:kern w:val="0"/>
           <w14:ligatures w14:val="none"/>
         </w:rPr>
         <w:t>Post-fix testing confirms that:</w:t>
@@ -3515,15 +3269,13 @@
         <w:rPr>
           <w:rFonts w:ascii="Times New Roman" w:eastAsia="Times New Roman" w:hAnsi="Times New Roman" w:cs="Times New Roman"/>
           <w:kern w:val="0"/>
-          <w:lang/>
-          <w14:ligatures w14:val="none"/>
-        </w:rPr>
-      </w:pPr>
-      <w:r>
-        <w:rPr>
-          <w:rFonts w:ascii="Times New Roman" w:eastAsia="Times New Roman" w:hAnsi="Times New Roman" w:cs="Times New Roman"/>
-          <w:kern w:val="0"/>
-          <w:lang/>
+          <w14:ligatures w14:val="none"/>
+        </w:rPr>
+      </w:pPr>
+      <w:r>
+        <w:rPr>
+          <w:rFonts w:ascii="Times New Roman" w:eastAsia="Times New Roman" w:hAnsi="Times New Roman" w:cs="Times New Roman"/>
+          <w:kern w:val="0"/>
           <w14:ligatures w14:val="none"/>
         </w:rPr>
         <w:t>Malicious payloads are no longer executed</w:t>
@@ -3539,15 +3291,13 @@
         <w:rPr>
           <w:rFonts w:ascii="Times New Roman" w:eastAsia="Times New Roman" w:hAnsi="Times New Roman" w:cs="Times New Roman"/>
           <w:kern w:val="0"/>
-          <w:lang/>
-          <w14:ligatures w14:val="none"/>
-        </w:rPr>
-      </w:pPr>
-      <w:r>
-        <w:rPr>
-          <w:rFonts w:ascii="Times New Roman" w:eastAsia="Times New Roman" w:hAnsi="Times New Roman" w:cs="Times New Roman"/>
-          <w:kern w:val="0"/>
-          <w:lang/>
+          <w14:ligatures w14:val="none"/>
+        </w:rPr>
+      </w:pPr>
+      <w:r>
+        <w:rPr>
+          <w:rFonts w:ascii="Times New Roman" w:eastAsia="Times New Roman" w:hAnsi="Times New Roman" w:cs="Times New Roman"/>
+          <w:kern w:val="0"/>
           <w14:ligatures w14:val="none"/>
         </w:rPr>
         <w:t>No custom errors appear in logs</w:t>
@@ -3563,15 +3313,13 @@
         <w:rPr>
           <w:rFonts w:ascii="Times New Roman" w:eastAsia="Times New Roman" w:hAnsi="Times New Roman" w:cs="Times New Roman"/>
           <w:kern w:val="0"/>
-          <w:lang/>
-          <w14:ligatures w14:val="none"/>
-        </w:rPr>
-      </w:pPr>
-      <w:r>
-        <w:rPr>
-          <w:rFonts w:ascii="Times New Roman" w:eastAsia="Times New Roman" w:hAnsi="Times New Roman" w:cs="Times New Roman"/>
-          <w:kern w:val="0"/>
-          <w:lang/>
+          <w14:ligatures w14:val="none"/>
+        </w:rPr>
+      </w:pPr>
+      <w:r>
+        <w:rPr>
+          <w:rFonts w:ascii="Times New Roman" w:eastAsia="Times New Roman" w:hAnsi="Times New Roman" w:cs="Times New Roman"/>
+          <w:kern w:val="0"/>
           <w14:ligatures w14:val="none"/>
         </w:rPr>
         <w:t>Normal functionality remains intact</w:t>
@@ -3876,109 +3624,319 @@
           <w:bCs/>
         </w:rPr>
       </w:pPr>
-      <w:r>
+    </w:p>
+    <w:p>
+      <w:pPr>
         <w:rPr>
           <w:b/>
           <w:bCs/>
         </w:rPr>
-        <w:t xml:space="preserve">5) </w:t>
-      </w:r>
-      <w:r>
+      </w:pPr>
+    </w:p>
+    <w:p>
+      <w:pPr>
         <w:rPr>
           <w:b/>
           <w:bCs/>
         </w:rPr>
+      </w:pPr>
+    </w:p>
+    <w:p>
+      <w:pPr>
+        <w:jc w:val="center"/>
+        <w:rPr>
+          <w:rFonts w:asciiTheme="majorBidi" w:hAnsiTheme="majorBidi" w:cstheme="majorBidi"/>
+          <w:b/>
+          <w:bCs/>
+          <w:i/>
+          <w:iCs/>
+        </w:rPr>
+      </w:pPr>
+      <w:r>
+        <w:rPr>
+          <w:rFonts w:asciiTheme="majorBidi" w:hAnsiTheme="majorBidi" w:cstheme="majorBidi"/>
+          <w:b/>
+          <w:bCs/>
+          <w:i/>
+          <w:iCs/>
+        </w:rPr>
+        <w:lastRenderedPageBreak/>
         <w:t>Lesson 9: Vulnerable Dependencies</w:t>
       </w:r>
     </w:p>
     <w:p/>
     <w:p>
-      <w:r>
-        <w:lastRenderedPageBreak/>
+      <w:pPr>
+        <w:rPr>
+          <w:rFonts w:asciiTheme="majorBidi" w:hAnsiTheme="majorBidi" w:cstheme="majorBidi"/>
+          <w:i/>
+          <w:iCs/>
+        </w:rPr>
+      </w:pPr>
+      <w:r>
+        <w:rPr>
+          <w:rFonts w:asciiTheme="majorBidi" w:hAnsiTheme="majorBidi" w:cstheme="majorBidi"/>
+          <w:i/>
+          <w:iCs/>
+        </w:rPr>
         <w:t>This lesson highlights the security risks introduced by vulnerable third-party dependencies used in the DVSA application.</w:t>
       </w:r>
     </w:p>
     <w:p>
-      <w:r>
+      <w:pPr>
+        <w:rPr>
+          <w:rFonts w:asciiTheme="majorBidi" w:hAnsiTheme="majorBidi" w:cstheme="majorBidi"/>
+          <w:i/>
+          <w:iCs/>
+        </w:rPr>
+      </w:pPr>
+      <w:r>
+        <w:rPr>
+          <w:rFonts w:asciiTheme="majorBidi" w:hAnsiTheme="majorBidi" w:cstheme="majorBidi"/>
+          <w:i/>
+          <w:iCs/>
+        </w:rPr>
         <w:t>The application relies on multiple external libraries, including node-serialize and node-</w:t>
       </w:r>
       <w:proofErr w:type="spellStart"/>
       <w:r>
+        <w:rPr>
+          <w:rFonts w:asciiTheme="majorBidi" w:hAnsiTheme="majorBidi" w:cstheme="majorBidi"/>
+          <w:i/>
+          <w:iCs/>
+        </w:rPr>
         <w:t>jose</w:t>
       </w:r>
       <w:proofErr w:type="spellEnd"/>
       <w:r>
+        <w:rPr>
+          <w:rFonts w:asciiTheme="majorBidi" w:hAnsiTheme="majorBidi" w:cstheme="majorBidi"/>
+          <w:i/>
+          <w:iCs/>
+        </w:rPr>
         <w:t>, both of which have known security vulnerabilities.</w:t>
       </w:r>
     </w:p>
     <w:p>
-      <w:r>
+      <w:pPr>
+        <w:rPr>
+          <w:rFonts w:asciiTheme="majorBidi" w:hAnsiTheme="majorBidi" w:cstheme="majorBidi"/>
+          <w:i/>
+          <w:iCs/>
+        </w:rPr>
+      </w:pPr>
+      <w:r>
+        <w:rPr>
+          <w:rFonts w:asciiTheme="majorBidi" w:hAnsiTheme="majorBidi" w:cstheme="majorBidi"/>
+          <w:i/>
+          <w:iCs/>
+        </w:rPr>
         <w:t>The node-serialize library is critically vulnerable because it allows execution of serialized functions using the _$$ND_FUNC$$_ pattern. This vulnerability was directly exploited in Lesson 1, where attacker-controlled input was executed within the Lambda environment. This demonstrates how a vulnerable dependency can lead to remote code execution.</w:t>
       </w:r>
     </w:p>
     <w:p>
-      <w:r>
+      <w:pPr>
+        <w:rPr>
+          <w:rFonts w:asciiTheme="majorBidi" w:hAnsiTheme="majorBidi" w:cstheme="majorBidi"/>
+          <w:i/>
+          <w:iCs/>
+        </w:rPr>
+      </w:pPr>
+      <w:r>
+        <w:rPr>
+          <w:rFonts w:asciiTheme="majorBidi" w:hAnsiTheme="majorBidi" w:cstheme="majorBidi"/>
+          <w:i/>
+          <w:iCs/>
+        </w:rPr>
         <w:t>In addition, the application uses node-</w:t>
       </w:r>
       <w:proofErr w:type="spellStart"/>
       <w:r>
+        <w:rPr>
+          <w:rFonts w:asciiTheme="majorBidi" w:hAnsiTheme="majorBidi" w:cstheme="majorBidi"/>
+          <w:i/>
+          <w:iCs/>
+        </w:rPr>
         <w:t>jose</w:t>
       </w:r>
       <w:proofErr w:type="spellEnd"/>
       <w:r>
+        <w:rPr>
+          <w:rFonts w:asciiTheme="majorBidi" w:hAnsiTheme="majorBidi" w:cstheme="majorBidi"/>
+          <w:i/>
+          <w:iCs/>
+        </w:rPr>
         <w:t>, which has several documented vulnerabilities, including:</w:t>
       </w:r>
     </w:p>
     <w:p>
-      <w:r>
+      <w:pPr>
+        <w:rPr>
+          <w:rFonts w:asciiTheme="majorBidi" w:hAnsiTheme="majorBidi" w:cstheme="majorBidi"/>
+          <w:i/>
+          <w:iCs/>
+        </w:rPr>
+      </w:pPr>
+      <w:r>
+        <w:rPr>
+          <w:rFonts w:asciiTheme="majorBidi" w:hAnsiTheme="majorBidi" w:cstheme="majorBidi"/>
+          <w:i/>
+          <w:iCs/>
+        </w:rPr>
         <w:t>• Invalid Curve Attack</w:t>
       </w:r>
     </w:p>
     <w:p>
-      <w:r>
+      <w:pPr>
+        <w:rPr>
+          <w:rFonts w:asciiTheme="majorBidi" w:hAnsiTheme="majorBidi" w:cstheme="majorBidi"/>
+          <w:i/>
+          <w:iCs/>
+        </w:rPr>
+      </w:pPr>
+      <w:r>
+        <w:rPr>
+          <w:rFonts w:asciiTheme="majorBidi" w:hAnsiTheme="majorBidi" w:cstheme="majorBidi"/>
+          <w:i/>
+          <w:iCs/>
+        </w:rPr>
         <w:t>• Regular Expression Denial of Service (</w:t>
       </w:r>
       <w:proofErr w:type="spellStart"/>
       <w:r>
+        <w:rPr>
+          <w:rFonts w:asciiTheme="majorBidi" w:hAnsiTheme="majorBidi" w:cstheme="majorBidi"/>
+          <w:i/>
+          <w:iCs/>
+        </w:rPr>
         <w:t>ReDoS</w:t>
       </w:r>
       <w:proofErr w:type="spellEnd"/>
       <w:r>
+        <w:rPr>
+          <w:rFonts w:asciiTheme="majorBidi" w:hAnsiTheme="majorBidi" w:cstheme="majorBidi"/>
+          <w:i/>
+          <w:iCs/>
+        </w:rPr>
         <w:t>)</w:t>
       </w:r>
     </w:p>
     <w:p>
-      <w:r>
+      <w:pPr>
+        <w:rPr>
+          <w:rFonts w:asciiTheme="majorBidi" w:hAnsiTheme="majorBidi" w:cstheme="majorBidi"/>
+          <w:i/>
+          <w:iCs/>
+        </w:rPr>
+      </w:pPr>
+      <w:r>
+        <w:rPr>
+          <w:rFonts w:asciiTheme="majorBidi" w:hAnsiTheme="majorBidi" w:cstheme="majorBidi"/>
+          <w:i/>
+          <w:iCs/>
+        </w:rPr>
         <w:t>• Potential command injection through dependent libraries</w:t>
       </w:r>
     </w:p>
     <w:p>
-      <w:r>
+      <w:pPr>
+        <w:rPr>
+          <w:rFonts w:asciiTheme="majorBidi" w:hAnsiTheme="majorBidi" w:cstheme="majorBidi"/>
+          <w:i/>
+          <w:iCs/>
+        </w:rPr>
+      </w:pPr>
+      <w:r>
+        <w:rPr>
+          <w:rFonts w:asciiTheme="majorBidi" w:hAnsiTheme="majorBidi" w:cstheme="majorBidi"/>
+          <w:i/>
+          <w:iCs/>
+        </w:rPr>
         <w:t>Although these vulnerabilities were not exploited in this demonstration, their presence increases the overall attack surface and risk level of the system.</w:t>
       </w:r>
     </w:p>
     <w:p>
-      <w:r>
+      <w:pPr>
+        <w:rPr>
+          <w:rFonts w:asciiTheme="majorBidi" w:hAnsiTheme="majorBidi" w:cstheme="majorBidi"/>
+          <w:i/>
+          <w:iCs/>
+        </w:rPr>
+      </w:pPr>
+      <w:r>
+        <w:rPr>
+          <w:rFonts w:asciiTheme="majorBidi" w:hAnsiTheme="majorBidi" w:cstheme="majorBidi"/>
+          <w:i/>
+          <w:iCs/>
+        </w:rPr>
         <w:t>This lesson reinforces the importance of secure dependency management. Applications must:</w:t>
       </w:r>
     </w:p>
     <w:p>
-      <w:r>
+      <w:pPr>
+        <w:rPr>
+          <w:rFonts w:asciiTheme="majorBidi" w:hAnsiTheme="majorBidi" w:cstheme="majorBidi"/>
+          <w:i/>
+          <w:iCs/>
+        </w:rPr>
+      </w:pPr>
+      <w:r>
+        <w:rPr>
+          <w:rFonts w:asciiTheme="majorBidi" w:hAnsiTheme="majorBidi" w:cstheme="majorBidi"/>
+          <w:i/>
+          <w:iCs/>
+        </w:rPr>
         <w:t>• Regularly scan dependencies for vulnerabilities</w:t>
       </w:r>
     </w:p>
     <w:p>
-      <w:r>
+      <w:pPr>
+        <w:rPr>
+          <w:rFonts w:asciiTheme="majorBidi" w:hAnsiTheme="majorBidi" w:cstheme="majorBidi"/>
+          <w:i/>
+          <w:iCs/>
+        </w:rPr>
+      </w:pPr>
+      <w:r>
+        <w:rPr>
+          <w:rFonts w:asciiTheme="majorBidi" w:hAnsiTheme="majorBidi" w:cstheme="majorBidi"/>
+          <w:i/>
+          <w:iCs/>
+        </w:rPr>
         <w:t>• Update or replace insecure libraries</w:t>
       </w:r>
     </w:p>
     <w:p>
-      <w:r>
+      <w:pPr>
+        <w:rPr>
+          <w:rFonts w:asciiTheme="majorBidi" w:hAnsiTheme="majorBidi" w:cstheme="majorBidi"/>
+          <w:i/>
+          <w:iCs/>
+        </w:rPr>
+      </w:pPr>
+      <w:r>
+        <w:rPr>
+          <w:rFonts w:asciiTheme="majorBidi" w:hAnsiTheme="majorBidi" w:cstheme="majorBidi"/>
+          <w:i/>
+          <w:iCs/>
+        </w:rPr>
         <w:t>• Avoid using libraries that execute dynamic or untrusted input</w:t>
       </w:r>
     </w:p>
     <w:p>
-      <w:r>
+      <w:pPr>
+        <w:rPr>
+          <w:rFonts w:asciiTheme="majorBidi" w:hAnsiTheme="majorBidi" w:cstheme="majorBidi"/>
+          <w:i/>
+          <w:iCs/>
+        </w:rPr>
+      </w:pPr>
+      <w:r>
+        <w:rPr>
+          <w:rFonts w:asciiTheme="majorBidi" w:hAnsiTheme="majorBidi" w:cstheme="majorBidi"/>
+          <w:i/>
+          <w:iCs/>
+        </w:rPr>
         <w:t>The root cause of the exploit demonstrated in Lesson 1 is directly tied to the use of node-serialize, making it a clear example of how vulnerable dependencies can compromise application security.</w:t>
       </w:r>
     </w:p>
@@ -3997,7 +3955,6 @@
           <w:kern w:val="0"/>
           <w:sz w:val="36"/>
           <w:szCs w:val="36"/>
-          <w:lang/>
           <w14:ligatures w14:val="none"/>
         </w:rPr>
       </w:pPr>
@@ -4011,7 +3968,6 @@
           <w:kern w:val="0"/>
           <w:sz w:val="36"/>
           <w:szCs w:val="36"/>
-          <w:lang/>
           <w14:ligatures w14:val="none"/>
         </w:rPr>
         <w:t>Takeaway / Lessons Learned</w:t>
@@ -4023,25 +3979,23 @@
         <w:rPr>
           <w:rFonts w:ascii="Times New Roman" w:eastAsia="Times New Roman" w:hAnsi="Times New Roman" w:cs="Times New Roman"/>
           <w:kern w:val="0"/>
-          <w:lang/>
-          <w14:ligatures w14:val="none"/>
-        </w:rPr>
-      </w:pPr>
-    </w:p>
-    <w:p>
-      <w:pPr>
-        <w:spacing w:before="100" w:beforeAutospacing="1" w:after="100" w:afterAutospacing="1" w:line="240" w:lineRule="auto"/>
-        <w:rPr>
-          <w:rFonts w:ascii="Times New Roman" w:eastAsia="Times New Roman" w:hAnsi="Times New Roman" w:cs="Times New Roman"/>
-          <w:kern w:val="0"/>
-          <w14:ligatures w14:val="none"/>
-        </w:rPr>
-      </w:pPr>
-      <w:r>
-        <w:rPr>
-          <w:rFonts w:ascii="Times New Roman" w:eastAsia="Times New Roman" w:hAnsi="Times New Roman" w:cs="Times New Roman"/>
-          <w:kern w:val="0"/>
-          <w:lang/>
+          <w14:ligatures w14:val="none"/>
+        </w:rPr>
+      </w:pPr>
+    </w:p>
+    <w:p>
+      <w:pPr>
+        <w:spacing w:before="100" w:beforeAutospacing="1" w:after="100" w:afterAutospacing="1" w:line="240" w:lineRule="auto"/>
+        <w:rPr>
+          <w:rFonts w:ascii="Times New Roman" w:eastAsia="Times New Roman" w:hAnsi="Times New Roman" w:cs="Times New Roman"/>
+          <w:kern w:val="0"/>
+          <w14:ligatures w14:val="none"/>
+        </w:rPr>
+      </w:pPr>
+      <w:r>
+        <w:rPr>
+          <w:rFonts w:ascii="Times New Roman" w:eastAsia="Times New Roman" w:hAnsi="Times New Roman" w:cs="Times New Roman"/>
+          <w:kern w:val="0"/>
           <w14:ligatures w14:val="none"/>
         </w:rPr>
         <w:t xml:space="preserve">This lesson demonstrates how unsafe deserialization can introduce critical vulnerabilities in serverless applications. By allowing user input to be interpreted as executable code, the system exposes itself to arbitrary code execution within the Lambda environment. This significantly </w:t>
@@ -4050,7 +4004,6 @@
         <w:rPr>
           <w:rFonts w:ascii="Times New Roman" w:eastAsia="Times New Roman" w:hAnsi="Times New Roman" w:cs="Times New Roman"/>
           <w:kern w:val="0"/>
-          <w:lang/>
           <w14:ligatures w14:val="none"/>
         </w:rPr>
         <w:lastRenderedPageBreak/>
@@ -4063,27 +4016,19 @@
         <w:rPr>
           <w:rFonts w:ascii="Times New Roman" w:eastAsia="Times New Roman" w:hAnsi="Times New Roman" w:cs="Times New Roman"/>
           <w:kern w:val="0"/>
-          <w:lang/>
-          <w14:ligatures w14:val="none"/>
-        </w:rPr>
-      </w:pPr>
-      <w:r>
-        <w:rPr>
-          <w:rFonts w:ascii="Times New Roman" w:eastAsia="Times New Roman" w:hAnsi="Times New Roman" w:cs="Times New Roman"/>
-          <w:kern w:val="0"/>
-          <w:lang/>
+          <w14:ligatures w14:val="none"/>
+        </w:rPr>
+      </w:pPr>
+      <w:r>
+        <w:rPr>
+          <w:rFonts w:ascii="Times New Roman" w:eastAsia="Times New Roman" w:hAnsi="Times New Roman" w:cs="Times New Roman"/>
+          <w:kern w:val="0"/>
           <w14:ligatures w14:val="none"/>
         </w:rPr>
         <w:t>The root cause highlights the importance of secure dependency management and strict input handling. Libraries that support dynamic execution should never be used on untrusted input. Instead, all request data must be treated strictly as data and validated using allowlists and safe parsing methods.</w:t>
       </w:r>
     </w:p>
-    <w:p>
-      <w:pPr>
-        <w:rPr>
-          <w:lang/>
-        </w:rPr>
-      </w:pPr>
-    </w:p>
+    <w:p/>
     <w:sectPr>
       <w:pgSz w:w="12240" w:h="15840"/>
       <w:pgMar w:top="1440" w:right="1440" w:bottom="1440" w:left="1440" w:header="708" w:footer="708" w:gutter="0"/>
@@ -5070,7 +5015,7 @@
         <w:kern w:val="2"/>
         <w:sz w:val="24"/>
         <w:szCs w:val="24"/>
-        <w:lang w:eastAsia="en-US" w:bidi="ar-SA"/>
+        <w:lang w:val="en-SA" w:eastAsia="en-US" w:bidi="ar-SA"/>
         <w14:ligatures w14:val="standardContextual"/>
       </w:rPr>
     </w:rPrDefault>
@@ -5666,6 +5611,7 @@
   <w:style w:type="character" w:default="1" w:styleId="DefaultParagraphFont">
     <w:name w:val="Default Paragraph Font"/>
     <w:uiPriority w:val="1"/>
+    <w:semiHidden/>
     <w:unhideWhenUsed/>
   </w:style>
   <w:style w:type="table" w:default="1" w:styleId="TableNormal">
@@ -5998,7 +5944,6 @@
     <w:rPr>
       <w:rFonts w:ascii="Times New Roman" w:eastAsia="Times New Roman" w:hAnsi="Times New Roman" w:cs="Times New Roman"/>
       <w:kern w:val="0"/>
-      <w:lang/>
       <w14:ligatures w14:val="none"/>
     </w:rPr>
   </w:style>
@@ -6017,7 +5962,6 @@
     <w:rPr>
       <w:rFonts w:ascii="Times New Roman" w:eastAsia="Times New Roman" w:hAnsi="Times New Roman" w:cs="Times New Roman"/>
       <w:kern w:val="0"/>
-      <w:lang/>
       <w14:ligatures w14:val="none"/>
     </w:rPr>
   </w:style>
@@ -6031,7 +5975,6 @@
     <w:rPr>
       <w:rFonts w:ascii="Times New Roman" w:eastAsia="Times New Roman" w:hAnsi="Times New Roman" w:cs="Times New Roman"/>
       <w:kern w:val="0"/>
-      <w:lang/>
       <w14:ligatures w14:val="none"/>
     </w:rPr>
   </w:style>
@@ -6050,7 +5993,6 @@
     <w:rPr>
       <w:rFonts w:ascii="Times New Roman" w:eastAsia="Times New Roman" w:hAnsi="Times New Roman" w:cs="Times New Roman"/>
       <w:kern w:val="0"/>
-      <w:lang/>
       <w14:ligatures w14:val="none"/>
     </w:rPr>
   </w:style>
@@ -6127,6 +6069,18 @@
         <w:insideV w:val="single" w:sz="4" w:space="0" w:color="auto"/>
       </w:tblBorders>
     </w:tblPr>
+  </w:style>
+  <w:style w:type="character" w:styleId="FollowedHyperlink">
+    <w:name w:val="FollowedHyperlink"/>
+    <w:basedOn w:val="DefaultParagraphFont"/>
+    <w:uiPriority w:val="99"/>
+    <w:semiHidden/>
+    <w:unhideWhenUsed/>
+    <w:rsid w:val="00E043E1"/>
+    <w:rPr>
+      <w:color w:val="96607D" w:themeColor="followedHyperlink"/>
+      <w:u w:val="single"/>
+    </w:rPr>
   </w:style>
 </w:styles>
 </file>

</xml_diff>